<commit_message>
Informe final en formato APA 7 según la rúbrica del proyecto
</commit_message>
<xml_diff>
--- a/docs/Informe_Simulador_Ascensor.docx
+++ b/docs/Informe_Simulador_Ascensor.docx
@@ -83,13 +83,10 @@
     </w:p>
     <w:p>
       <w:pPr>
-        <w:jc w:val="center"/>
+        <w:pStyle w:val="Heading1"/>
       </w:pPr>
       <w:r>
-        <w:rPr>
-          <w:b/>
-        </w:rPr>
-        <w:t>Simulador de un Ascensor: Fuerzas y Movimiento</w:t>
+        <w:t>Introducción</w:t>
       </w:r>
     </w:p>
     <w:p>
@@ -4215,6 +4212,623 @@
     </w:p>
     <w:p>
       <w:pPr>
+        <w:pStyle w:val="Heading2"/>
+      </w:pPr>
+      <w:r>
+        <w:t>Cumplimiento de los Requisitos del Proyecto</w:t>
+      </w:r>
+    </w:p>
+    <w:p>
+      <w:pPr>
+        <w:ind w:firstLine="720"/>
+      </w:pPr>
+      <w:r>
+        <w:t>La Tabla 4 relaciona cada requisito del enunciado del Proyecto 4 y de los requisitos generales con la forma en que el programa lo cumple.</w:t>
+      </w:r>
+    </w:p>
+    <w:p>
+      <w:pPr>
+        <w:keepNext/>
+      </w:pPr>
+      <w:r>
+        <w:rPr>
+          <w:b/>
+        </w:rPr>
+        <w:t>Tabla 4</w:t>
+      </w:r>
+    </w:p>
+    <w:p>
+      <w:pPr>
+        <w:keepNext/>
+      </w:pPr>
+      <w:r>
+        <w:rPr>
+          <w:i/>
+        </w:rPr>
+        <w:t>Requisitos del Enunciado y su Cumplimiento en el Programa</w:t>
+      </w:r>
+    </w:p>
+    <w:tbl>
+      <w:tblPr>
+        <w:tblW w:type="auto" w:w="0"/>
+        <w:jc w:val="center"/>
+        <w:tblLayout w:type="fixed"/>
+        <w:tblLook w:firstColumn="1" w:firstRow="1" w:lastColumn="0" w:lastRow="0" w:noHBand="0" w:noVBand="1" w:val="04A0"/>
+      </w:tblPr>
+      <w:tblGrid>
+        <w:gridCol w:w="2551"/>
+        <w:gridCol w:w="6520"/>
+      </w:tblGrid>
+      <w:tr>
+        <w:trPr>
+          <w:cantSplit/>
+        </w:trPr>
+        <w:tc>
+          <w:tcPr>
+            <w:tcW w:type="dxa" w:w="2551"/>
+            <w:tcBorders>
+              <w:top w:val="single" w:sz="6" w:color="000000"/>
+              <w:left w:val="nil"/>
+              <w:bottom w:val="single" w:sz="6" w:color="000000"/>
+              <w:right w:val="nil"/>
+            </w:tcBorders>
+          </w:tcPr>
+          <w:p>
+            <w:pPr>
+              <w:keepNext/>
+              <w:spacing w:line="240" w:lineRule="auto" w:before="60" w:after="60"/>
+              <w:jc w:val="center"/>
+            </w:pPr>
+            <w:r/>
+            <w:r>
+              <w:t>Requisito</w:t>
+            </w:r>
+          </w:p>
+        </w:tc>
+        <w:tc>
+          <w:tcPr>
+            <w:tcW w:type="dxa" w:w="6520"/>
+            <w:tcBorders>
+              <w:top w:val="single" w:sz="6" w:color="000000"/>
+              <w:left w:val="nil"/>
+              <w:bottom w:val="single" w:sz="6" w:color="000000"/>
+              <w:right w:val="nil"/>
+            </w:tcBorders>
+          </w:tcPr>
+          <w:p>
+            <w:pPr>
+              <w:keepNext/>
+              <w:spacing w:line="240" w:lineRule="auto" w:before="60" w:after="60"/>
+              <w:jc w:val="center"/>
+            </w:pPr>
+            <w:r/>
+            <w:r>
+              <w:t>Cómo lo cumple el programa</w:t>
+            </w:r>
+          </w:p>
+        </w:tc>
+      </w:tr>
+      <w:tr>
+        <w:trPr>
+          <w:cantSplit/>
+        </w:trPr>
+        <w:tc>
+          <w:tcPr>
+            <w:tcW w:type="dxa" w:w="2551"/>
+            <w:tcBorders>
+              <w:top w:val="nil"/>
+              <w:left w:val="nil"/>
+              <w:bottom w:val="nil"/>
+              <w:right w:val="nil"/>
+            </w:tcBorders>
+          </w:tcPr>
+          <w:p>
+            <w:pPr>
+              <w:keepNext/>
+              <w:spacing w:line="240" w:lineRule="auto" w:before="60" w:after="60"/>
+            </w:pPr>
+            <w:r/>
+            <w:r>
+              <w:t>Datos de entrada</w:t>
+            </w:r>
+          </w:p>
+        </w:tc>
+        <w:tc>
+          <w:tcPr>
+            <w:tcW w:type="dxa" w:w="6520"/>
+            <w:tcBorders>
+              <w:top w:val="nil"/>
+              <w:left w:val="nil"/>
+              <w:bottom w:val="nil"/>
+              <w:right w:val="nil"/>
+            </w:tcBorders>
+          </w:tcPr>
+          <w:p>
+            <w:pPr>
+              <w:keepNext/>
+              <w:spacing w:line="240" w:lineRule="auto" w:before="60" w:after="60"/>
+            </w:pPr>
+            <w:r/>
+            <w:r>
+              <w:t>Masa del ascensor, masa de pasajeros, gravedad, aceleración, piso inicial y piso de destino; además, velocidad máxima y altura por piso</w:t>
+            </w:r>
+          </w:p>
+        </w:tc>
+      </w:tr>
+      <w:tr>
+        <w:trPr>
+          <w:cantSplit/>
+        </w:trPr>
+        <w:tc>
+          <w:tcPr>
+            <w:tcW w:type="dxa" w:w="2551"/>
+            <w:tcBorders>
+              <w:top w:val="nil"/>
+              <w:left w:val="nil"/>
+              <w:bottom w:val="nil"/>
+              <w:right w:val="nil"/>
+            </w:tcBorders>
+          </w:tcPr>
+          <w:p>
+            <w:pPr>
+              <w:keepNext/>
+              <w:spacing w:line="240" w:lineRule="auto" w:before="60" w:after="60"/>
+            </w:pPr>
+            <w:r/>
+            <w:r>
+              <w:t>Cálculo automático</w:t>
+            </w:r>
+          </w:p>
+        </w:tc>
+        <w:tc>
+          <w:tcPr>
+            <w:tcW w:type="dxa" w:w="6520"/>
+            <w:tcBorders>
+              <w:top w:val="nil"/>
+              <w:left w:val="nil"/>
+              <w:bottom w:val="nil"/>
+              <w:right w:val="nil"/>
+            </w:tcBorders>
+          </w:tcPr>
+          <w:p>
+            <w:pPr>
+              <w:keepNext/>
+              <w:spacing w:line="240" w:lineRule="auto" w:before="60" w:after="60"/>
+            </w:pPr>
+            <w:r/>
+            <w:r>
+              <w:t>Masa total, peso, fuerza neta, tensión del cable, velocidad y tiempo de desplazamiento, calculados por las clases físicas</w:t>
+            </w:r>
+          </w:p>
+        </w:tc>
+      </w:tr>
+      <w:tr>
+        <w:trPr>
+          <w:cantSplit/>
+        </w:trPr>
+        <w:tc>
+          <w:tcPr>
+            <w:tcW w:type="dxa" w:w="2551"/>
+            <w:tcBorders>
+              <w:top w:val="nil"/>
+              <w:left w:val="nil"/>
+              <w:bottom w:val="nil"/>
+              <w:right w:val="nil"/>
+            </w:tcBorders>
+          </w:tcPr>
+          <w:p>
+            <w:pPr>
+              <w:keepNext/>
+              <w:spacing w:line="240" w:lineRule="auto" w:before="60" w:after="60"/>
+            </w:pPr>
+            <w:r/>
+            <w:r>
+              <w:t>Edificio y ascensor animado</w:t>
+            </w:r>
+          </w:p>
+        </w:tc>
+        <w:tc>
+          <w:tcPr>
+            <w:tcW w:type="dxa" w:w="6520"/>
+            <w:tcBorders>
+              <w:top w:val="nil"/>
+              <w:left w:val="nil"/>
+              <w:bottom w:val="nil"/>
+              <w:right w:val="nil"/>
+            </w:tcBorders>
+          </w:tcPr>
+          <w:p>
+            <w:pPr>
+              <w:keepNext/>
+              <w:spacing w:line="240" w:lineRule="auto" w:before="60" w:after="60"/>
+            </w:pPr>
+            <w:r/>
+            <w:r>
+              <w:t>Edificio de 10 pisos; la cabina sube y baja al pulsar Iniciar simulación</w:t>
+            </w:r>
+          </w:p>
+        </w:tc>
+      </w:tr>
+      <w:tr>
+        <w:trPr>
+          <w:cantSplit/>
+        </w:trPr>
+        <w:tc>
+          <w:tcPr>
+            <w:tcW w:type="dxa" w:w="2551"/>
+            <w:tcBorders>
+              <w:top w:val="nil"/>
+              <w:left w:val="nil"/>
+              <w:bottom w:val="nil"/>
+              <w:right w:val="nil"/>
+            </w:tcBorders>
+          </w:tcPr>
+          <w:p>
+            <w:pPr>
+              <w:keepNext/>
+              <w:spacing w:line="240" w:lineRule="auto" w:before="60" w:after="60"/>
+            </w:pPr>
+            <w:r/>
+            <w:r>
+              <w:t>Etapas del viaje</w:t>
+            </w:r>
+          </w:p>
+        </w:tc>
+        <w:tc>
+          <w:tcPr>
+            <w:tcW w:type="dxa" w:w="6520"/>
+            <w:tcBorders>
+              <w:top w:val="nil"/>
+              <w:left w:val="nil"/>
+              <w:bottom w:val="nil"/>
+              <w:right w:val="nil"/>
+            </w:tcBorders>
+          </w:tcPr>
+          <w:p>
+            <w:pPr>
+              <w:keepNext/>
+              <w:spacing w:line="240" w:lineRule="auto" w:before="60" w:after="60"/>
+            </w:pPr>
+            <w:r/>
+            <w:r>
+              <w:t>Arranque, Movimiento, Frenado y Detención, indicadas en la barra superior y en la tabla de fuerzas por fase</w:t>
+            </w:r>
+          </w:p>
+        </w:tc>
+      </w:tr>
+      <w:tr>
+        <w:trPr>
+          <w:cantSplit/>
+        </w:trPr>
+        <w:tc>
+          <w:tcPr>
+            <w:tcW w:type="dxa" w:w="2551"/>
+            <w:tcBorders>
+              <w:top w:val="nil"/>
+              <w:left w:val="nil"/>
+              <w:bottom w:val="nil"/>
+              <w:right w:val="nil"/>
+            </w:tcBorders>
+          </w:tcPr>
+          <w:p>
+            <w:pPr>
+              <w:keepNext/>
+              <w:spacing w:line="240" w:lineRule="auto" w:before="60" w:after="60"/>
+            </w:pPr>
+            <w:r/>
+            <w:r>
+              <w:t>Panel de información en tiempo real</w:t>
+            </w:r>
+          </w:p>
+        </w:tc>
+        <w:tc>
+          <w:tcPr>
+            <w:tcW w:type="dxa" w:w="6520"/>
+            <w:tcBorders>
+              <w:top w:val="nil"/>
+              <w:left w:val="nil"/>
+              <w:bottom w:val="nil"/>
+              <w:right w:val="nil"/>
+            </w:tcBorders>
+          </w:tcPr>
+          <w:p>
+            <w:pPr>
+              <w:keepNext/>
+              <w:spacing w:line="240" w:lineRule="auto" w:before="60" w:after="60"/>
+            </w:pPr>
+            <w:r/>
+            <w:r>
+              <w:t>Tiempo, posición, velocidad, aceleración, fuerza neta, peso y tensión, actualizados en cada cuadro</w:t>
+            </w:r>
+          </w:p>
+        </w:tc>
+      </w:tr>
+      <w:tr>
+        <w:trPr>
+          <w:cantSplit/>
+        </w:trPr>
+        <w:tc>
+          <w:tcPr>
+            <w:tcW w:type="dxa" w:w="2551"/>
+            <w:tcBorders>
+              <w:top w:val="nil"/>
+              <w:left w:val="nil"/>
+              <w:bottom w:val="nil"/>
+              <w:right w:val="nil"/>
+            </w:tcBorders>
+          </w:tcPr>
+          <w:p>
+            <w:pPr>
+              <w:keepNext/>
+              <w:spacing w:line="240" w:lineRule="auto" w:before="60" w:after="60"/>
+            </w:pPr>
+            <w:r/>
+            <w:r>
+              <w:t>Gráficas</w:t>
+            </w:r>
+          </w:p>
+        </w:tc>
+        <w:tc>
+          <w:tcPr>
+            <w:tcW w:type="dxa" w:w="6520"/>
+            <w:tcBorders>
+              <w:top w:val="nil"/>
+              <w:left w:val="nil"/>
+              <w:bottom w:val="nil"/>
+              <w:right w:val="nil"/>
+            </w:tcBorders>
+          </w:tcPr>
+          <w:p>
+            <w:pPr>
+              <w:keepNext/>
+              <w:spacing w:line="240" w:lineRule="auto" w:before="60" w:after="60"/>
+            </w:pPr>
+            <w:r/>
+            <w:r>
+              <w:t>Posición y(t), velocidad v(t) y aceleración a(t)</w:t>
+            </w:r>
+          </w:p>
+        </w:tc>
+      </w:tr>
+      <w:tr>
+        <w:trPr>
+          <w:cantSplit/>
+        </w:trPr>
+        <w:tc>
+          <w:tcPr>
+            <w:tcW w:type="dxa" w:w="2551"/>
+            <w:tcBorders>
+              <w:top w:val="nil"/>
+              <w:left w:val="nil"/>
+              <w:bottom w:val="nil"/>
+              <w:right w:val="nil"/>
+            </w:tcBorders>
+          </w:tcPr>
+          <w:p>
+            <w:pPr>
+              <w:keepNext/>
+              <w:spacing w:line="240" w:lineRule="auto" w:before="60" w:after="60"/>
+            </w:pPr>
+            <w:r/>
+            <w:r>
+              <w:t>Interfaz gráfica</w:t>
+            </w:r>
+          </w:p>
+        </w:tc>
+        <w:tc>
+          <w:tcPr>
+            <w:tcW w:type="dxa" w:w="6520"/>
+            <w:tcBorders>
+              <w:top w:val="nil"/>
+              <w:left w:val="nil"/>
+              <w:bottom w:val="nil"/>
+              <w:right w:val="nil"/>
+            </w:tcBorders>
+          </w:tcPr>
+          <w:p>
+            <w:pPr>
+              <w:keepNext/>
+              <w:spacing w:line="240" w:lineRule="auto" w:before="60" w:after="60"/>
+            </w:pPr>
+            <w:r/>
+            <w:r>
+              <w:t>Permite introducir datos, ejecutar, pausar, reiniciar, ver resultados, gráficas y la situación física; no usa la consola</w:t>
+            </w:r>
+          </w:p>
+        </w:tc>
+      </w:tr>
+      <w:tr>
+        <w:trPr>
+          <w:cantSplit/>
+        </w:trPr>
+        <w:tc>
+          <w:tcPr>
+            <w:tcW w:type="dxa" w:w="2551"/>
+            <w:tcBorders>
+              <w:top w:val="nil"/>
+              <w:left w:val="nil"/>
+              <w:bottom w:val="nil"/>
+              <w:right w:val="nil"/>
+            </w:tcBorders>
+          </w:tcPr>
+          <w:p>
+            <w:pPr>
+              <w:keepNext/>
+              <w:spacing w:line="240" w:lineRule="auto" w:before="60" w:after="60"/>
+            </w:pPr>
+            <w:r/>
+            <w:r>
+              <w:t>Representación de la situación</w:t>
+            </w:r>
+          </w:p>
+        </w:tc>
+        <w:tc>
+          <w:tcPr>
+            <w:tcW w:type="dxa" w:w="6520"/>
+            <w:tcBorders>
+              <w:top w:val="nil"/>
+              <w:left w:val="nil"/>
+              <w:bottom w:val="nil"/>
+              <w:right w:val="nil"/>
+            </w:tcBorders>
+          </w:tcPr>
+          <w:p>
+            <w:pPr>
+              <w:keepNext/>
+              <w:spacing w:line="240" w:lineRule="auto" w:before="60" w:after="60"/>
+            </w:pPr>
+            <w:r/>
+            <w:r>
+              <w:t>Dibujo 2D con cabina, cable, polea, pasajeros y diagrama de cuerpo libre (flechas T y P)</w:t>
+            </w:r>
+          </w:p>
+        </w:tc>
+      </w:tr>
+      <w:tr>
+        <w:trPr>
+          <w:cantSplit/>
+        </w:trPr>
+        <w:tc>
+          <w:tcPr>
+            <w:tcW w:type="dxa" w:w="2551"/>
+            <w:tcBorders>
+              <w:top w:val="nil"/>
+              <w:left w:val="nil"/>
+              <w:bottom w:val="nil"/>
+              <w:right w:val="nil"/>
+            </w:tcBorders>
+          </w:tcPr>
+          <w:p>
+            <w:pPr>
+              <w:keepNext/>
+              <w:spacing w:line="240" w:lineRule="auto" w:before="60" w:after="60"/>
+            </w:pPr>
+            <w:r/>
+            <w:r>
+              <w:t>Cálculos en el código</w:t>
+            </w:r>
+          </w:p>
+        </w:tc>
+        <w:tc>
+          <w:tcPr>
+            <w:tcW w:type="dxa" w:w="6520"/>
+            <w:tcBorders>
+              <w:top w:val="nil"/>
+              <w:left w:val="nil"/>
+              <w:bottom w:val="nil"/>
+              <w:right w:val="nil"/>
+            </w:tcBorders>
+          </w:tcPr>
+          <w:p>
+            <w:pPr>
+              <w:keepNext/>
+              <w:spacing w:line="240" w:lineRule="auto" w:before="60" w:after="60"/>
+            </w:pPr>
+            <w:r/>
+            <w:r>
+              <w:t>Ningún resultado se introduce a mano; cada ecuación está comentada junto a su cálculo (Tabla 5)</w:t>
+            </w:r>
+          </w:p>
+        </w:tc>
+      </w:tr>
+      <w:tr>
+        <w:trPr>
+          <w:cantSplit/>
+        </w:trPr>
+        <w:tc>
+          <w:tcPr>
+            <w:tcW w:type="dxa" w:w="2551"/>
+            <w:tcBorders>
+              <w:top w:val="nil"/>
+              <w:left w:val="nil"/>
+              <w:bottom w:val="nil"/>
+              <w:right w:val="nil"/>
+            </w:tcBorders>
+          </w:tcPr>
+          <w:p>
+            <w:pPr>
+              <w:keepNext/>
+              <w:spacing w:line="240" w:lineRule="auto" w:before="60" w:after="60"/>
+            </w:pPr>
+            <w:r/>
+            <w:r>
+              <w:t>Unidades</w:t>
+            </w:r>
+          </w:p>
+        </w:tc>
+        <w:tc>
+          <w:tcPr>
+            <w:tcW w:type="dxa" w:w="6520"/>
+            <w:tcBorders>
+              <w:top w:val="nil"/>
+              <w:left w:val="nil"/>
+              <w:bottom w:val="nil"/>
+              <w:right w:val="nil"/>
+            </w:tcBorders>
+          </w:tcPr>
+          <w:p>
+            <w:pPr>
+              <w:keepNext/>
+              <w:spacing w:line="240" w:lineRule="auto" w:before="60" w:after="60"/>
+            </w:pPr>
+            <w:r/>
+            <w:r>
+              <w:t>Todos los valores se muestran con unidad: kg, N, m, m/s, m/s² y s</w:t>
+            </w:r>
+          </w:p>
+        </w:tc>
+      </w:tr>
+      <w:tr>
+        <w:trPr>
+          <w:cantSplit/>
+        </w:trPr>
+        <w:tc>
+          <w:tcPr>
+            <w:tcW w:type="dxa" w:w="2551"/>
+            <w:tcBorders>
+              <w:top w:val="nil"/>
+              <w:left w:val="nil"/>
+              <w:bottom w:val="single" w:sz="6" w:color="000000"/>
+              <w:right w:val="nil"/>
+            </w:tcBorders>
+          </w:tcPr>
+          <w:p>
+            <w:pPr>
+              <w:keepNext/>
+              <w:spacing w:line="240" w:lineRule="auto" w:before="60" w:after="60"/>
+            </w:pPr>
+            <w:r/>
+            <w:r>
+              <w:t>Código fuente</w:t>
+            </w:r>
+          </w:p>
+        </w:tc>
+        <w:tc>
+          <w:tcPr>
+            <w:tcW w:type="dxa" w:w="6520"/>
+            <w:tcBorders>
+              <w:top w:val="nil"/>
+              <w:left w:val="nil"/>
+              <w:bottom w:val="single" w:sz="6" w:color="000000"/>
+              <w:right w:val="nil"/>
+            </w:tcBorders>
+          </w:tcPr>
+          <w:p>
+            <w:pPr>
+              <w:keepNext/>
+              <w:spacing w:line="240" w:lineRule="auto" w:before="60" w:after="60"/>
+            </w:pPr>
+            <w:r/>
+            <w:r>
+              <w:t>Organizado en módulos y clases, con nombres en español, comentarios y sin código innecesario</w:t>
+            </w:r>
+          </w:p>
+        </w:tc>
+      </w:tr>
+    </w:tbl>
+    <w:p/>
+    <w:p>
+      <w:pPr>
         <w:pStyle w:val="Heading1"/>
       </w:pPr>
       <w:r>
@@ -4695,7 +5309,7 @@
         <w:pStyle w:val="Heading2"/>
       </w:pPr>
       <w:r>
-        <w:t>Animación y Gráficas</w:t>
+        <w:t>Ecuaciones en el Código</w:t>
       </w:r>
     </w:p>
     <w:p>
@@ -4703,7 +5317,1302 @@
         <w:ind w:firstLine="720"/>
       </w:pPr>
       <w:r>
-        <w:t>El reloj de la animación (useAnimacion) usa requestAnimationFrame y mide el tiempo real transcurrido entre cuadros con performance.now. Así, un viaje de 6,47 s dura 6,47 s en pantalla, independientemente de la velocidad del computador. En cada cuadro se llama a estadoEn(t) y se redibujan el edificio y las tablas.</w:t>
+        <w:t>Como lo exige el enunciado, cada ecuación física está implementada en un único lugar del código y lleva un comentario con la fórmula que aplica. La Tabla 5 indica dónde se encuentra cada una.</w:t>
+      </w:r>
+    </w:p>
+    <w:p>
+      <w:pPr>
+        <w:keepNext/>
+      </w:pPr>
+      <w:r>
+        <w:rPr>
+          <w:b/>
+        </w:rPr>
+        <w:t>Tabla 5</w:t>
+      </w:r>
+    </w:p>
+    <w:p>
+      <w:pPr>
+        <w:keepNext/>
+      </w:pPr>
+      <w:r>
+        <w:rPr>
+          <w:i/>
+        </w:rPr>
+        <w:t>Ubicación de las Ecuaciones Físicas en el Código Fuente</w:t>
+      </w:r>
+    </w:p>
+    <w:tbl>
+      <w:tblPr>
+        <w:tblW w:type="auto" w:w="0"/>
+        <w:jc w:val="center"/>
+        <w:tblLayout w:type="fixed"/>
+        <w:tblLook w:firstColumn="1" w:firstRow="1" w:lastColumn="0" w:lastRow="0" w:noHBand="0" w:noVBand="1" w:val="04A0"/>
+      </w:tblPr>
+      <w:tblGrid>
+        <w:gridCol w:w="1134"/>
+        <w:gridCol w:w="3969"/>
+        <w:gridCol w:w="3969"/>
+      </w:tblGrid>
+      <w:tr>
+        <w:trPr>
+          <w:cantSplit/>
+        </w:trPr>
+        <w:tc>
+          <w:tcPr>
+            <w:tcW w:type="dxa" w:w="1134"/>
+            <w:tcBorders>
+              <w:top w:val="single" w:sz="6" w:color="000000"/>
+              <w:left w:val="nil"/>
+              <w:bottom w:val="single" w:sz="6" w:color="000000"/>
+              <w:right w:val="nil"/>
+            </w:tcBorders>
+          </w:tcPr>
+          <w:p>
+            <w:pPr>
+              <w:keepNext/>
+              <w:spacing w:line="240" w:lineRule="auto" w:before="60" w:after="60"/>
+              <w:jc w:val="center"/>
+            </w:pPr>
+            <w:r/>
+            <w:r>
+              <w:t>Ecuación</w:t>
+            </w:r>
+          </w:p>
+        </w:tc>
+        <w:tc>
+          <w:tcPr>
+            <w:tcW w:type="dxa" w:w="3969"/>
+            <w:tcBorders>
+              <w:top w:val="single" w:sz="6" w:color="000000"/>
+              <w:left w:val="nil"/>
+              <w:bottom w:val="single" w:sz="6" w:color="000000"/>
+              <w:right w:val="nil"/>
+            </w:tcBorders>
+          </w:tcPr>
+          <w:p>
+            <w:pPr>
+              <w:keepNext/>
+              <w:spacing w:line="240" w:lineRule="auto" w:before="60" w:after="60"/>
+              <w:jc w:val="center"/>
+            </w:pPr>
+            <w:r/>
+            <w:r>
+              <w:t>Expresión</w:t>
+            </w:r>
+          </w:p>
+        </w:tc>
+        <w:tc>
+          <w:tcPr>
+            <w:tcW w:type="dxa" w:w="3969"/>
+            <w:tcBorders>
+              <w:top w:val="single" w:sz="6" w:color="000000"/>
+              <w:left w:val="nil"/>
+              <w:bottom w:val="single" w:sz="6" w:color="000000"/>
+              <w:right w:val="nil"/>
+            </w:tcBorders>
+          </w:tcPr>
+          <w:p>
+            <w:pPr>
+              <w:keepNext/>
+              <w:spacing w:line="240" w:lineRule="auto" w:before="60" w:after="60"/>
+              <w:jc w:val="center"/>
+            </w:pPr>
+            <w:r/>
+            <w:r>
+              <w:t>Archivo y método</w:t>
+            </w:r>
+          </w:p>
+        </w:tc>
+      </w:tr>
+      <w:tr>
+        <w:trPr>
+          <w:cantSplit/>
+        </w:trPr>
+        <w:tc>
+          <w:tcPr>
+            <w:tcW w:type="dxa" w:w="1134"/>
+            <w:tcBorders>
+              <w:top w:val="nil"/>
+              <w:left w:val="nil"/>
+              <w:bottom w:val="nil"/>
+              <w:right w:val="nil"/>
+            </w:tcBorders>
+          </w:tcPr>
+          <w:p>
+            <w:pPr>
+              <w:keepNext/>
+              <w:spacing w:line="240" w:lineRule="auto" w:before="60" w:after="60"/>
+            </w:pPr>
+            <w:r/>
+            <w:r>
+              <w:t>1</w:t>
+            </w:r>
+          </w:p>
+        </w:tc>
+        <w:tc>
+          <w:tcPr>
+            <w:tcW w:type="dxa" w:w="3969"/>
+            <w:tcBorders>
+              <w:top w:val="nil"/>
+              <w:left w:val="nil"/>
+              <w:bottom w:val="nil"/>
+              <w:right w:val="nil"/>
+            </w:tcBorders>
+          </w:tcPr>
+          <w:p>
+            <w:pPr>
+              <w:keepNext/>
+              <w:spacing w:line="240" w:lineRule="auto" w:before="60" w:after="60"/>
+            </w:pPr>
+            <w:r/>
+            <w:r>
+              <w:rPr>
+                <w:i/>
+              </w:rPr>
+              <w:t>m</w:t>
+            </w:r>
+            <w:r>
+              <w:t xml:space="preserve"> = </w:t>
+            </w:r>
+            <w:r>
+              <w:rPr>
+                <w:i/>
+              </w:rPr>
+              <w:t>m</w:t>
+            </w:r>
+            <w:r>
+              <w:rPr>
+                <w:vertAlign w:val="subscript"/>
+              </w:rPr>
+              <w:t>c</w:t>
+            </w:r>
+            <w:r>
+              <w:t xml:space="preserve"> + </w:t>
+            </w:r>
+            <w:r>
+              <w:rPr>
+                <w:i/>
+              </w:rPr>
+              <w:t>m</w:t>
+            </w:r>
+            <w:r>
+              <w:rPr>
+                <w:vertAlign w:val="subscript"/>
+              </w:rPr>
+              <w:t>p</w:t>
+            </w:r>
+          </w:p>
+        </w:tc>
+        <w:tc>
+          <w:tcPr>
+            <w:tcW w:type="dxa" w:w="3969"/>
+            <w:tcBorders>
+              <w:top w:val="nil"/>
+              <w:left w:val="nil"/>
+              <w:bottom w:val="nil"/>
+              <w:right w:val="nil"/>
+            </w:tcBorders>
+          </w:tcPr>
+          <w:p>
+            <w:pPr>
+              <w:keepNext/>
+              <w:spacing w:line="240" w:lineRule="auto" w:before="60" w:after="60"/>
+            </w:pPr>
+            <w:r/>
+            <w:r>
+              <w:t>Ascensor.js, masaTotal</w:t>
+            </w:r>
+          </w:p>
+        </w:tc>
+      </w:tr>
+      <w:tr>
+        <w:trPr>
+          <w:cantSplit/>
+        </w:trPr>
+        <w:tc>
+          <w:tcPr>
+            <w:tcW w:type="dxa" w:w="1134"/>
+            <w:tcBorders>
+              <w:top w:val="nil"/>
+              <w:left w:val="nil"/>
+              <w:bottom w:val="nil"/>
+              <w:right w:val="nil"/>
+            </w:tcBorders>
+          </w:tcPr>
+          <w:p>
+            <w:pPr>
+              <w:keepNext/>
+              <w:spacing w:line="240" w:lineRule="auto" w:before="60" w:after="60"/>
+            </w:pPr>
+            <w:r/>
+            <w:r>
+              <w:t>2</w:t>
+            </w:r>
+          </w:p>
+        </w:tc>
+        <w:tc>
+          <w:tcPr>
+            <w:tcW w:type="dxa" w:w="3969"/>
+            <w:tcBorders>
+              <w:top w:val="nil"/>
+              <w:left w:val="nil"/>
+              <w:bottom w:val="nil"/>
+              <w:right w:val="nil"/>
+            </w:tcBorders>
+          </w:tcPr>
+          <w:p>
+            <w:pPr>
+              <w:keepNext/>
+              <w:spacing w:line="240" w:lineRule="auto" w:before="60" w:after="60"/>
+            </w:pPr>
+            <w:r/>
+            <w:r>
+              <w:rPr>
+                <w:i/>
+              </w:rPr>
+              <w:t>P</w:t>
+            </w:r>
+            <w:r>
+              <w:t xml:space="preserve"> = </w:t>
+            </w:r>
+            <w:r>
+              <w:rPr>
+                <w:i/>
+              </w:rPr>
+              <w:t>m</w:t>
+            </w:r>
+            <w:r>
+              <w:t>·</w:t>
+            </w:r>
+            <w:r>
+              <w:rPr>
+                <w:i/>
+              </w:rPr>
+              <w:t>g</w:t>
+            </w:r>
+          </w:p>
+        </w:tc>
+        <w:tc>
+          <w:tcPr>
+            <w:tcW w:type="dxa" w:w="3969"/>
+            <w:tcBorders>
+              <w:top w:val="nil"/>
+              <w:left w:val="nil"/>
+              <w:bottom w:val="nil"/>
+              <w:right w:val="nil"/>
+            </w:tcBorders>
+          </w:tcPr>
+          <w:p>
+            <w:pPr>
+              <w:keepNext/>
+              <w:spacing w:line="240" w:lineRule="auto" w:before="60" w:after="60"/>
+            </w:pPr>
+            <w:r/>
+            <w:r>
+              <w:t>Ascensor.js, peso()</w:t>
+            </w:r>
+          </w:p>
+        </w:tc>
+      </w:tr>
+      <w:tr>
+        <w:trPr>
+          <w:cantSplit/>
+        </w:trPr>
+        <w:tc>
+          <w:tcPr>
+            <w:tcW w:type="dxa" w:w="1134"/>
+            <w:tcBorders>
+              <w:top w:val="nil"/>
+              <w:left w:val="nil"/>
+              <w:bottom w:val="nil"/>
+              <w:right w:val="nil"/>
+            </w:tcBorders>
+          </w:tcPr>
+          <w:p>
+            <w:pPr>
+              <w:keepNext/>
+              <w:spacing w:line="240" w:lineRule="auto" w:before="60" w:after="60"/>
+            </w:pPr>
+            <w:r/>
+            <w:r>
+              <w:t>3</w:t>
+            </w:r>
+          </w:p>
+        </w:tc>
+        <w:tc>
+          <w:tcPr>
+            <w:tcW w:type="dxa" w:w="3969"/>
+            <w:tcBorders>
+              <w:top w:val="nil"/>
+              <w:left w:val="nil"/>
+              <w:bottom w:val="nil"/>
+              <w:right w:val="nil"/>
+            </w:tcBorders>
+          </w:tcPr>
+          <w:p>
+            <w:pPr>
+              <w:keepNext/>
+              <w:spacing w:line="240" w:lineRule="auto" w:before="60" w:after="60"/>
+            </w:pPr>
+            <w:r/>
+            <w:r>
+              <w:t>Σ</w:t>
+            </w:r>
+            <w:r>
+              <w:rPr>
+                <w:i/>
+              </w:rPr>
+              <w:t>F</w:t>
+            </w:r>
+            <w:r>
+              <w:t xml:space="preserve"> = </w:t>
+            </w:r>
+            <w:r>
+              <w:rPr>
+                <w:i/>
+              </w:rPr>
+              <w:t>m</w:t>
+            </w:r>
+            <w:r>
+              <w:t>·</w:t>
+            </w:r>
+            <w:r>
+              <w:rPr>
+                <w:i/>
+              </w:rPr>
+              <w:t>a</w:t>
+            </w:r>
+          </w:p>
+        </w:tc>
+        <w:tc>
+          <w:tcPr>
+            <w:tcW w:type="dxa" w:w="3969"/>
+            <w:tcBorders>
+              <w:top w:val="nil"/>
+              <w:left w:val="nil"/>
+              <w:bottom w:val="nil"/>
+              <w:right w:val="nil"/>
+            </w:tcBorders>
+          </w:tcPr>
+          <w:p>
+            <w:pPr>
+              <w:keepNext/>
+              <w:spacing w:line="240" w:lineRule="auto" w:before="60" w:after="60"/>
+            </w:pPr>
+            <w:r/>
+            <w:r>
+              <w:t>Ascensor.js, fuerzaNeta()</w:t>
+            </w:r>
+          </w:p>
+        </w:tc>
+      </w:tr>
+      <w:tr>
+        <w:trPr>
+          <w:cantSplit/>
+        </w:trPr>
+        <w:tc>
+          <w:tcPr>
+            <w:tcW w:type="dxa" w:w="1134"/>
+            <w:tcBorders>
+              <w:top w:val="nil"/>
+              <w:left w:val="nil"/>
+              <w:bottom w:val="nil"/>
+              <w:right w:val="nil"/>
+            </w:tcBorders>
+          </w:tcPr>
+          <w:p>
+            <w:pPr>
+              <w:keepNext/>
+              <w:spacing w:line="240" w:lineRule="auto" w:before="60" w:after="60"/>
+            </w:pPr>
+            <w:r/>
+            <w:r>
+              <w:t>4</w:t>
+            </w:r>
+          </w:p>
+        </w:tc>
+        <w:tc>
+          <w:tcPr>
+            <w:tcW w:type="dxa" w:w="3969"/>
+            <w:tcBorders>
+              <w:top w:val="nil"/>
+              <w:left w:val="nil"/>
+              <w:bottom w:val="nil"/>
+              <w:right w:val="nil"/>
+            </w:tcBorders>
+          </w:tcPr>
+          <w:p>
+            <w:pPr>
+              <w:keepNext/>
+              <w:spacing w:line="240" w:lineRule="auto" w:before="60" w:after="60"/>
+            </w:pPr>
+            <w:r/>
+            <w:r>
+              <w:rPr>
+                <w:i/>
+              </w:rPr>
+              <w:t>T</w:t>
+            </w:r>
+            <w:r>
+              <w:t xml:space="preserve"> = </w:t>
+            </w:r>
+            <w:r>
+              <w:rPr>
+                <w:i/>
+              </w:rPr>
+              <w:t>m</w:t>
+            </w:r>
+            <w:r>
+              <w:t>(</w:t>
+            </w:r>
+            <w:r>
+              <w:rPr>
+                <w:i/>
+              </w:rPr>
+              <w:t>g</w:t>
+            </w:r>
+            <w:r>
+              <w:t xml:space="preserve"> + </w:t>
+            </w:r>
+            <w:r>
+              <w:rPr>
+                <w:i/>
+              </w:rPr>
+              <w:t>a</w:t>
+            </w:r>
+            <w:r>
+              <w:t>)</w:t>
+            </w:r>
+          </w:p>
+        </w:tc>
+        <w:tc>
+          <w:tcPr>
+            <w:tcW w:type="dxa" w:w="3969"/>
+            <w:tcBorders>
+              <w:top w:val="nil"/>
+              <w:left w:val="nil"/>
+              <w:bottom w:val="nil"/>
+              <w:right w:val="nil"/>
+            </w:tcBorders>
+          </w:tcPr>
+          <w:p>
+            <w:pPr>
+              <w:keepNext/>
+              <w:spacing w:line="240" w:lineRule="auto" w:before="60" w:after="60"/>
+            </w:pPr>
+            <w:r/>
+            <w:r>
+              <w:t>Ascensor.js, tension()</w:t>
+            </w:r>
+          </w:p>
+        </w:tc>
+      </w:tr>
+      <w:tr>
+        <w:trPr>
+          <w:cantSplit/>
+        </w:trPr>
+        <w:tc>
+          <w:tcPr>
+            <w:tcW w:type="dxa" w:w="1134"/>
+            <w:tcBorders>
+              <w:top w:val="nil"/>
+              <w:left w:val="nil"/>
+              <w:bottom w:val="nil"/>
+              <w:right w:val="nil"/>
+            </w:tcBorders>
+          </w:tcPr>
+          <w:p>
+            <w:pPr>
+              <w:keepNext/>
+              <w:spacing w:line="240" w:lineRule="auto" w:before="60" w:after="60"/>
+            </w:pPr>
+            <w:r/>
+            <w:r>
+              <w:t>5</w:t>
+            </w:r>
+          </w:p>
+        </w:tc>
+        <w:tc>
+          <w:tcPr>
+            <w:tcW w:type="dxa" w:w="3969"/>
+            <w:tcBorders>
+              <w:top w:val="nil"/>
+              <w:left w:val="nil"/>
+              <w:bottom w:val="nil"/>
+              <w:right w:val="nil"/>
+            </w:tcBorders>
+          </w:tcPr>
+          <w:p>
+            <w:pPr>
+              <w:keepNext/>
+              <w:spacing w:line="240" w:lineRule="auto" w:before="60" w:after="60"/>
+            </w:pPr>
+            <w:r/>
+            <w:r>
+              <w:rPr>
+                <w:i/>
+              </w:rPr>
+              <w:t>v</w:t>
+            </w:r>
+            <w:r>
+              <w:t xml:space="preserve"> = </w:t>
+            </w:r>
+            <w:r>
+              <w:rPr>
+                <w:i/>
+              </w:rPr>
+              <w:t>a</w:t>
+            </w:r>
+            <w:r>
+              <w:t>·</w:t>
+            </w:r>
+            <w:r>
+              <w:rPr>
+                <w:i/>
+              </w:rPr>
+              <w:t>t</w:t>
+            </w:r>
+            <w:r>
+              <w:t xml:space="preserve">, </w:t>
+            </w:r>
+            <w:r>
+              <w:rPr>
+                <w:i/>
+              </w:rPr>
+              <w:t>x</w:t>
+            </w:r>
+            <w:r>
+              <w:t xml:space="preserve"> = ½·</w:t>
+            </w:r>
+            <w:r>
+              <w:rPr>
+                <w:i/>
+              </w:rPr>
+              <w:t>a</w:t>
+            </w:r>
+            <w:r>
+              <w:t>·</w:t>
+            </w:r>
+            <w:r>
+              <w:rPr>
+                <w:i/>
+              </w:rPr>
+              <w:t>t</w:t>
+            </w:r>
+            <w:r>
+              <w:t>²</w:t>
+            </w:r>
+          </w:p>
+        </w:tc>
+        <w:tc>
+          <w:tcPr>
+            <w:tcW w:type="dxa" w:w="3969"/>
+            <w:tcBorders>
+              <w:top w:val="nil"/>
+              <w:left w:val="nil"/>
+              <w:bottom w:val="nil"/>
+              <w:right w:val="nil"/>
+            </w:tcBorders>
+          </w:tcPr>
+          <w:p>
+            <w:pPr>
+              <w:keepNext/>
+              <w:spacing w:line="240" w:lineRule="auto" w:before="60" w:after="60"/>
+            </w:pPr>
+            <w:r/>
+            <w:r>
+              <w:t>PerfilMovimiento.js, estadoEn()</w:t>
+            </w:r>
+          </w:p>
+        </w:tc>
+      </w:tr>
+      <w:tr>
+        <w:trPr>
+          <w:cantSplit/>
+        </w:trPr>
+        <w:tc>
+          <w:tcPr>
+            <w:tcW w:type="dxa" w:w="1134"/>
+            <w:tcBorders>
+              <w:top w:val="nil"/>
+              <w:left w:val="nil"/>
+              <w:bottom w:val="nil"/>
+              <w:right w:val="nil"/>
+            </w:tcBorders>
+          </w:tcPr>
+          <w:p>
+            <w:pPr>
+              <w:keepNext/>
+              <w:spacing w:line="240" w:lineRule="auto" w:before="60" w:after="60"/>
+            </w:pPr>
+            <w:r/>
+            <w:r>
+              <w:t>6</w:t>
+            </w:r>
+          </w:p>
+        </w:tc>
+        <w:tc>
+          <w:tcPr>
+            <w:tcW w:type="dxa" w:w="3969"/>
+            <w:tcBorders>
+              <w:top w:val="nil"/>
+              <w:left w:val="nil"/>
+              <w:bottom w:val="nil"/>
+              <w:right w:val="nil"/>
+            </w:tcBorders>
+          </w:tcPr>
+          <w:p>
+            <w:pPr>
+              <w:keepNext/>
+              <w:spacing w:line="240" w:lineRule="auto" w:before="60" w:after="60"/>
+            </w:pPr>
+            <w:r/>
+            <w:r>
+              <w:rPr>
+                <w:i/>
+              </w:rPr>
+              <w:t>t</w:t>
+            </w:r>
+            <w:r>
+              <w:rPr>
+                <w:vertAlign w:val="subscript"/>
+              </w:rPr>
+              <w:t>a</w:t>
+            </w:r>
+            <w:r>
+              <w:t xml:space="preserve"> = </w:t>
+            </w:r>
+            <w:r>
+              <w:rPr>
+                <w:i/>
+              </w:rPr>
+              <w:t>v</w:t>
+            </w:r>
+            <w:r>
+              <w:rPr>
+                <w:vertAlign w:val="subscript"/>
+              </w:rPr>
+              <w:t>máx</w:t>
+            </w:r>
+            <w:r>
+              <w:t>/</w:t>
+            </w:r>
+            <w:r>
+              <w:rPr>
+                <w:i/>
+              </w:rPr>
+              <w:t>a</w:t>
+            </w:r>
+            <w:r>
+              <w:t xml:space="preserve">, </w:t>
+            </w:r>
+            <w:r>
+              <w:rPr>
+                <w:i/>
+              </w:rPr>
+              <w:t>x</w:t>
+            </w:r>
+            <w:r>
+              <w:rPr>
+                <w:vertAlign w:val="subscript"/>
+              </w:rPr>
+              <w:t>a</w:t>
+            </w:r>
+            <w:r>
+              <w:t xml:space="preserve"> = </w:t>
+            </w:r>
+            <w:r>
+              <w:rPr>
+                <w:i/>
+              </w:rPr>
+              <w:t>v</w:t>
+            </w:r>
+            <w:r>
+              <w:rPr>
+                <w:vertAlign w:val="subscript"/>
+              </w:rPr>
+              <w:t>máx</w:t>
+            </w:r>
+            <w:r>
+              <w:t>²/(2</w:t>
+            </w:r>
+            <w:r>
+              <w:rPr>
+                <w:i/>
+              </w:rPr>
+              <w:t>a</w:t>
+            </w:r>
+            <w:r>
+              <w:t>)</w:t>
+            </w:r>
+          </w:p>
+        </w:tc>
+        <w:tc>
+          <w:tcPr>
+            <w:tcW w:type="dxa" w:w="3969"/>
+            <w:tcBorders>
+              <w:top w:val="nil"/>
+              <w:left w:val="nil"/>
+              <w:bottom w:val="nil"/>
+              <w:right w:val="nil"/>
+            </w:tcBorders>
+          </w:tcPr>
+          <w:p>
+            <w:pPr>
+              <w:keepNext/>
+              <w:spacing w:line="240" w:lineRule="auto" w:before="60" w:after="60"/>
+            </w:pPr>
+            <w:r/>
+            <w:r>
+              <w:t>PerfilMovimiento.js, constructor</w:t>
+            </w:r>
+          </w:p>
+        </w:tc>
+      </w:tr>
+      <w:tr>
+        <w:trPr>
+          <w:cantSplit/>
+        </w:trPr>
+        <w:tc>
+          <w:tcPr>
+            <w:tcW w:type="dxa" w:w="1134"/>
+            <w:tcBorders>
+              <w:top w:val="nil"/>
+              <w:left w:val="nil"/>
+              <w:bottom w:val="nil"/>
+              <w:right w:val="nil"/>
+            </w:tcBorders>
+          </w:tcPr>
+          <w:p>
+            <w:pPr>
+              <w:keepNext/>
+              <w:spacing w:line="240" w:lineRule="auto" w:before="60" w:after="60"/>
+            </w:pPr>
+            <w:r/>
+            <w:r>
+              <w:t>7</w:t>
+            </w:r>
+          </w:p>
+        </w:tc>
+        <w:tc>
+          <w:tcPr>
+            <w:tcW w:type="dxa" w:w="3969"/>
+            <w:tcBorders>
+              <w:top w:val="nil"/>
+              <w:left w:val="nil"/>
+              <w:bottom w:val="nil"/>
+              <w:right w:val="nil"/>
+            </w:tcBorders>
+          </w:tcPr>
+          <w:p>
+            <w:pPr>
+              <w:keepNext/>
+              <w:spacing w:line="240" w:lineRule="auto" w:before="60" w:after="60"/>
+            </w:pPr>
+            <w:r/>
+            <w:r>
+              <w:rPr>
+                <w:i/>
+              </w:rPr>
+              <w:t>x</w:t>
+            </w:r>
+            <w:r>
+              <w:t xml:space="preserve"> = </w:t>
+            </w:r>
+            <w:r>
+              <w:rPr>
+                <w:i/>
+              </w:rPr>
+              <w:t>x</w:t>
+            </w:r>
+            <w:r>
+              <w:rPr>
+                <w:vertAlign w:val="subscript"/>
+              </w:rPr>
+              <w:t>0</w:t>
+            </w:r>
+            <w:r>
+              <w:t xml:space="preserve"> + </w:t>
+            </w:r>
+            <w:r>
+              <w:rPr>
+                <w:i/>
+              </w:rPr>
+              <w:t>v</w:t>
+            </w:r>
+            <w:r>
+              <w:rPr>
+                <w:vertAlign w:val="subscript"/>
+              </w:rPr>
+              <w:t>máx</w:t>
+            </w:r>
+            <w:r>
+              <w:t>·</w:t>
+            </w:r>
+            <w:r>
+              <w:rPr>
+                <w:i/>
+              </w:rPr>
+              <w:t>t</w:t>
+            </w:r>
+          </w:p>
+        </w:tc>
+        <w:tc>
+          <w:tcPr>
+            <w:tcW w:type="dxa" w:w="3969"/>
+            <w:tcBorders>
+              <w:top w:val="nil"/>
+              <w:left w:val="nil"/>
+              <w:bottom w:val="nil"/>
+              <w:right w:val="nil"/>
+            </w:tcBorders>
+          </w:tcPr>
+          <w:p>
+            <w:pPr>
+              <w:keepNext/>
+              <w:spacing w:line="240" w:lineRule="auto" w:before="60" w:after="60"/>
+            </w:pPr>
+            <w:r/>
+            <w:r>
+              <w:t>PerfilMovimiento.js, estadoEn()</w:t>
+            </w:r>
+          </w:p>
+        </w:tc>
+      </w:tr>
+      <w:tr>
+        <w:trPr>
+          <w:cantSplit/>
+        </w:trPr>
+        <w:tc>
+          <w:tcPr>
+            <w:tcW w:type="dxa" w:w="1134"/>
+            <w:tcBorders>
+              <w:top w:val="nil"/>
+              <w:left w:val="nil"/>
+              <w:bottom w:val="nil"/>
+              <w:right w:val="nil"/>
+            </w:tcBorders>
+          </w:tcPr>
+          <w:p>
+            <w:pPr>
+              <w:keepNext/>
+              <w:spacing w:line="240" w:lineRule="auto" w:before="60" w:after="60"/>
+            </w:pPr>
+            <w:r/>
+            <w:r>
+              <w:t>8</w:t>
+            </w:r>
+          </w:p>
+        </w:tc>
+        <w:tc>
+          <w:tcPr>
+            <w:tcW w:type="dxa" w:w="3969"/>
+            <w:tcBorders>
+              <w:top w:val="nil"/>
+              <w:left w:val="nil"/>
+              <w:bottom w:val="nil"/>
+              <w:right w:val="nil"/>
+            </w:tcBorders>
+          </w:tcPr>
+          <w:p>
+            <w:pPr>
+              <w:keepNext/>
+              <w:spacing w:line="240" w:lineRule="auto" w:before="60" w:after="60"/>
+            </w:pPr>
+            <w:r/>
+            <w:r>
+              <w:rPr>
+                <w:i/>
+              </w:rPr>
+              <w:t>x</w:t>
+            </w:r>
+            <w:r>
+              <w:t xml:space="preserve"> = </w:t>
+            </w:r>
+            <w:r>
+              <w:rPr>
+                <w:i/>
+              </w:rPr>
+              <w:t>x</w:t>
+            </w:r>
+            <w:r>
+              <w:rPr>
+                <w:vertAlign w:val="subscript"/>
+              </w:rPr>
+              <w:t>0</w:t>
+            </w:r>
+            <w:r>
+              <w:t xml:space="preserve"> + </w:t>
+            </w:r>
+            <w:r>
+              <w:rPr>
+                <w:i/>
+              </w:rPr>
+              <w:t>v</w:t>
+            </w:r>
+            <w:r>
+              <w:rPr>
+                <w:vertAlign w:val="subscript"/>
+              </w:rPr>
+              <w:t>máx</w:t>
+            </w:r>
+            <w:r>
+              <w:t>·</w:t>
+            </w:r>
+            <w:r>
+              <w:rPr>
+                <w:i/>
+              </w:rPr>
+              <w:t>t</w:t>
+            </w:r>
+            <w:r>
+              <w:t xml:space="preserve"> − ½·</w:t>
+            </w:r>
+            <w:r>
+              <w:rPr>
+                <w:i/>
+              </w:rPr>
+              <w:t>a</w:t>
+            </w:r>
+            <w:r>
+              <w:t>·</w:t>
+            </w:r>
+            <w:r>
+              <w:rPr>
+                <w:i/>
+              </w:rPr>
+              <w:t>t</w:t>
+            </w:r>
+            <w:r>
+              <w:t>²</w:t>
+            </w:r>
+          </w:p>
+        </w:tc>
+        <w:tc>
+          <w:tcPr>
+            <w:tcW w:type="dxa" w:w="3969"/>
+            <w:tcBorders>
+              <w:top w:val="nil"/>
+              <w:left w:val="nil"/>
+              <w:bottom w:val="nil"/>
+              <w:right w:val="nil"/>
+            </w:tcBorders>
+          </w:tcPr>
+          <w:p>
+            <w:pPr>
+              <w:keepNext/>
+              <w:spacing w:line="240" w:lineRule="auto" w:before="60" w:after="60"/>
+            </w:pPr>
+            <w:r/>
+            <w:r>
+              <w:t>PerfilMovimiento.js, estadoEn()</w:t>
+            </w:r>
+          </w:p>
+        </w:tc>
+      </w:tr>
+      <w:tr>
+        <w:trPr>
+          <w:cantSplit/>
+        </w:trPr>
+        <w:tc>
+          <w:tcPr>
+            <w:tcW w:type="dxa" w:w="1134"/>
+            <w:tcBorders>
+              <w:top w:val="nil"/>
+              <w:left w:val="nil"/>
+              <w:bottom w:val="nil"/>
+              <w:right w:val="nil"/>
+            </w:tcBorders>
+          </w:tcPr>
+          <w:p>
+            <w:pPr>
+              <w:keepNext/>
+              <w:spacing w:line="240" w:lineRule="auto" w:before="60" w:after="60"/>
+            </w:pPr>
+            <w:r/>
+            <w:r>
+              <w:t>9</w:t>
+            </w:r>
+          </w:p>
+        </w:tc>
+        <w:tc>
+          <w:tcPr>
+            <w:tcW w:type="dxa" w:w="3969"/>
+            <w:tcBorders>
+              <w:top w:val="nil"/>
+              <w:left w:val="nil"/>
+              <w:bottom w:val="nil"/>
+              <w:right w:val="nil"/>
+            </w:tcBorders>
+          </w:tcPr>
+          <w:p>
+            <w:pPr>
+              <w:keepNext/>
+              <w:spacing w:line="240" w:lineRule="auto" w:before="60" w:after="60"/>
+            </w:pPr>
+            <w:r/>
+            <w:r>
+              <w:rPr>
+                <w:i/>
+              </w:rPr>
+              <w:t>t</w:t>
+            </w:r>
+            <w:r>
+              <w:rPr>
+                <w:vertAlign w:val="subscript"/>
+              </w:rPr>
+              <w:t>total</w:t>
+            </w:r>
+            <w:r>
+              <w:t xml:space="preserve"> = 2</w:t>
+            </w:r>
+            <w:r>
+              <w:rPr>
+                <w:i/>
+              </w:rPr>
+              <w:t>t</w:t>
+            </w:r>
+            <w:r>
+              <w:rPr>
+                <w:vertAlign w:val="subscript"/>
+              </w:rPr>
+              <w:t>a</w:t>
+            </w:r>
+            <w:r>
+              <w:t xml:space="preserve"> + </w:t>
+            </w:r>
+            <w:r>
+              <w:rPr>
+                <w:i/>
+              </w:rPr>
+              <w:t>t</w:t>
+            </w:r>
+            <w:r>
+              <w:rPr>
+                <w:vertAlign w:val="subscript"/>
+              </w:rPr>
+              <w:t>c</w:t>
+            </w:r>
+          </w:p>
+        </w:tc>
+        <w:tc>
+          <w:tcPr>
+            <w:tcW w:type="dxa" w:w="3969"/>
+            <w:tcBorders>
+              <w:top w:val="nil"/>
+              <w:left w:val="nil"/>
+              <w:bottom w:val="nil"/>
+              <w:right w:val="nil"/>
+            </w:tcBorders>
+          </w:tcPr>
+          <w:p>
+            <w:pPr>
+              <w:keepNext/>
+              <w:spacing w:line="240" w:lineRule="auto" w:before="60" w:after="60"/>
+            </w:pPr>
+            <w:r/>
+            <w:r>
+              <w:t>PerfilMovimiento.js, constructor</w:t>
+            </w:r>
+          </w:p>
+        </w:tc>
+      </w:tr>
+      <w:tr>
+        <w:trPr>
+          <w:cantSplit/>
+        </w:trPr>
+        <w:tc>
+          <w:tcPr>
+            <w:tcW w:type="dxa" w:w="1134"/>
+            <w:tcBorders>
+              <w:top w:val="nil"/>
+              <w:left w:val="nil"/>
+              <w:bottom w:val="nil"/>
+              <w:right w:val="nil"/>
+            </w:tcBorders>
+          </w:tcPr>
+          <w:p>
+            <w:pPr>
+              <w:keepNext/>
+              <w:spacing w:line="240" w:lineRule="auto" w:before="60" w:after="60"/>
+            </w:pPr>
+            <w:r/>
+            <w:r>
+              <w:t>10</w:t>
+            </w:r>
+          </w:p>
+        </w:tc>
+        <w:tc>
+          <w:tcPr>
+            <w:tcW w:type="dxa" w:w="3969"/>
+            <w:tcBorders>
+              <w:top w:val="nil"/>
+              <w:left w:val="nil"/>
+              <w:bottom w:val="nil"/>
+              <w:right w:val="nil"/>
+            </w:tcBorders>
+          </w:tcPr>
+          <w:p>
+            <w:pPr>
+              <w:keepNext/>
+              <w:spacing w:line="240" w:lineRule="auto" w:before="60" w:after="60"/>
+            </w:pPr>
+            <w:r/>
+            <w:r>
+              <w:rPr>
+                <w:i/>
+              </w:rPr>
+              <w:t>v</w:t>
+            </w:r>
+            <w:r>
+              <w:rPr>
+                <w:vertAlign w:val="subscript"/>
+              </w:rPr>
+              <w:t>pico</w:t>
+            </w:r>
+            <w:r>
+              <w:t xml:space="preserve"> = √(</w:t>
+            </w:r>
+            <w:r>
+              <w:rPr>
+                <w:i/>
+              </w:rPr>
+              <w:t>a</w:t>
+            </w:r>
+            <w:r>
+              <w:t>·</w:t>
+            </w:r>
+            <w:r>
+              <w:rPr>
+                <w:i/>
+              </w:rPr>
+              <w:t>d</w:t>
+            </w:r>
+            <w:r>
+              <w:t>)</w:t>
+            </w:r>
+          </w:p>
+        </w:tc>
+        <w:tc>
+          <w:tcPr>
+            <w:tcW w:type="dxa" w:w="3969"/>
+            <w:tcBorders>
+              <w:top w:val="nil"/>
+              <w:left w:val="nil"/>
+              <w:bottom w:val="nil"/>
+              <w:right w:val="nil"/>
+            </w:tcBorders>
+          </w:tcPr>
+          <w:p>
+            <w:pPr>
+              <w:keepNext/>
+              <w:spacing w:line="240" w:lineRule="auto" w:before="60" w:after="60"/>
+            </w:pPr>
+            <w:r/>
+            <w:r>
+              <w:t>PerfilMovimiento.js, constructor</w:t>
+            </w:r>
+          </w:p>
+        </w:tc>
+      </w:tr>
+      <w:tr>
+        <w:trPr>
+          <w:cantSplit/>
+        </w:trPr>
+        <w:tc>
+          <w:tcPr>
+            <w:tcW w:type="dxa" w:w="1134"/>
+            <w:tcBorders>
+              <w:top w:val="nil"/>
+              <w:left w:val="nil"/>
+              <w:bottom w:val="single" w:sz="6" w:color="000000"/>
+              <w:right w:val="nil"/>
+            </w:tcBorders>
+          </w:tcPr>
+          <w:p>
+            <w:pPr>
+              <w:keepNext/>
+              <w:spacing w:line="240" w:lineRule="auto" w:before="60" w:after="60"/>
+            </w:pPr>
+            <w:r/>
+            <w:r>
+              <w:t>—</w:t>
+            </w:r>
+          </w:p>
+        </w:tc>
+        <w:tc>
+          <w:tcPr>
+            <w:tcW w:type="dxa" w:w="3969"/>
+            <w:tcBorders>
+              <w:top w:val="nil"/>
+              <w:left w:val="nil"/>
+              <w:bottom w:val="single" w:sz="6" w:color="000000"/>
+              <w:right w:val="nil"/>
+            </w:tcBorders>
+          </w:tcPr>
+          <w:p>
+            <w:pPr>
+              <w:keepNext/>
+              <w:spacing w:line="240" w:lineRule="auto" w:before="60" w:after="60"/>
+            </w:pPr>
+            <w:r/>
+            <w:r>
+              <w:rPr>
+                <w:i/>
+              </w:rPr>
+              <w:t>d</w:t>
+            </w:r>
+            <w:r>
+              <w:t xml:space="preserve"> = |Δ</w:t>
+            </w:r>
+            <w:r>
+              <w:rPr>
+                <w:i/>
+              </w:rPr>
+              <w:t>piso</w:t>
+            </w:r>
+            <w:r>
+              <w:t>|·</w:t>
+            </w:r>
+            <w:r>
+              <w:rPr>
+                <w:i/>
+              </w:rPr>
+              <w:t>h</w:t>
+            </w:r>
+          </w:p>
+        </w:tc>
+        <w:tc>
+          <w:tcPr>
+            <w:tcW w:type="dxa" w:w="3969"/>
+            <w:tcBorders>
+              <w:top w:val="nil"/>
+              <w:left w:val="nil"/>
+              <w:bottom w:val="single" w:sz="6" w:color="000000"/>
+              <w:right w:val="nil"/>
+            </w:tcBorders>
+          </w:tcPr>
+          <w:p>
+            <w:pPr>
+              <w:keepNext/>
+              <w:spacing w:line="240" w:lineRule="auto" w:before="60" w:after="60"/>
+            </w:pPr>
+            <w:r/>
+            <w:r>
+              <w:t>Simulacion.js, constructor</w:t>
+            </w:r>
+          </w:p>
+        </w:tc>
+      </w:tr>
+    </w:tbl>
+    <w:p/>
+    <w:p>
+      <w:pPr>
+        <w:pStyle w:val="Heading2"/>
+      </w:pPr>
+      <w:r>
+        <w:t>Animación y Gráficas</w:t>
       </w:r>
     </w:p>
     <w:p>
@@ -4711,6 +6620,14 @@
         <w:ind w:firstLine="720"/>
       </w:pPr>
       <w:r>
+        <w:t>El reloj de la animación (useAnimacion) usa requestAnimationFrame y mide el tiempo real transcurrido entre cuadros con performance.now. Así, un viaje de 6,47 s dura 6,47 s en pantalla, independientemente de la velocidad del computador. En cada cuadro se llama a estadoEn(t) y se redibujan el edificio y las tablas.</w:t>
+      </w:r>
+    </w:p>
+    <w:p>
+      <w:pPr>
+        <w:ind w:firstLine="720"/>
+      </w:pPr>
+      <w:r>
         <w:t>Para las gráficas, el método muestrear(200) evalúa estadoEn en 200 instantes equiespaciados entre 0 y el tiempo total. La clase GraficaLinea dibuja la serie completa en gris y, encima, el tramo recorrido hasta el instante actual en color, terminado en un punto que marca el estado presente. Las marcas de los ejes se calculan con pasos redondos (1, 2, 2,5 o 5 por una potencia de 10).</w:t>
       </w:r>
     </w:p>
@@ -4743,7 +6660,7 @@
         <w:ind w:firstLine="720"/>
       </w:pPr>
       <w:r>
-        <w:t>Se ejecutaron cinco simulaciones con datos distintos. La Tabla 4 resume los resultados que calculó el programa, y las Figuras 2 a 7 muestran capturas de pantalla de varios momentos y casos.</w:t>
+        <w:t>Se ejecutaron cinco simulaciones con datos distintos. La Tabla 6 muestra la evolución del viaje del ejemplo de la rúbrica en el tiempo, la Tabla 7 resume los resultados de las cinco simulaciones y las Figuras 2 a 8 muestran capturas de pantalla de varios momentos, casos y gráficas.</w:t>
       </w:r>
     </w:p>
     <w:p>
@@ -4754,7 +6671,1845 @@
         <w:rPr>
           <w:b/>
         </w:rPr>
-        <w:t>Tabla 4</w:t>
+        <w:t>Tabla 6</w:t>
+      </w:r>
+    </w:p>
+    <w:p>
+      <w:pPr>
+        <w:keepNext/>
+      </w:pPr>
+      <w:r>
+        <w:rPr>
+          <w:i/>
+        </w:rPr>
+        <w:t>Evolución del Viaje del Piso 1 al 5 (Ejemplo de la Rúbrica)</w:t>
+      </w:r>
+    </w:p>
+    <w:tbl>
+      <w:tblPr>
+        <w:tblW w:type="auto" w:w="0"/>
+        <w:jc w:val="center"/>
+        <w:tblLayout w:type="fixed"/>
+        <w:tblLook w:firstColumn="1" w:firstRow="1" w:lastColumn="0" w:lastRow="0" w:noHBand="0" w:noVBand="1" w:val="04A0"/>
+      </w:tblPr>
+      <w:tblGrid>
+        <w:gridCol w:w="907"/>
+        <w:gridCol w:w="1701"/>
+        <w:gridCol w:w="1077"/>
+        <w:gridCol w:w="1191"/>
+        <w:gridCol w:w="1247"/>
+        <w:gridCol w:w="1134"/>
+        <w:gridCol w:w="1134"/>
+      </w:tblGrid>
+      <w:tr>
+        <w:trPr>
+          <w:cantSplit/>
+        </w:trPr>
+        <w:tc>
+          <w:tcPr>
+            <w:tcW w:type="dxa" w:w="907"/>
+            <w:tcBorders>
+              <w:top w:val="single" w:sz="6" w:color="000000"/>
+              <w:left w:val="nil"/>
+              <w:bottom w:val="single" w:sz="6" w:color="000000"/>
+              <w:right w:val="nil"/>
+            </w:tcBorders>
+          </w:tcPr>
+          <w:p>
+            <w:pPr>
+              <w:keepNext/>
+              <w:spacing w:line="240" w:lineRule="auto" w:before="60" w:after="60"/>
+              <w:jc w:val="center"/>
+            </w:pPr>
+            <w:r/>
+            <w:r>
+              <w:rPr>
+                <w:i/>
+              </w:rPr>
+              <w:t>t</w:t>
+            </w:r>
+            <w:r>
+              <w:t xml:space="preserve"> (s)</w:t>
+            </w:r>
+          </w:p>
+        </w:tc>
+        <w:tc>
+          <w:tcPr>
+            <w:tcW w:type="dxa" w:w="1701"/>
+            <w:tcBorders>
+              <w:top w:val="single" w:sz="6" w:color="000000"/>
+              <w:left w:val="nil"/>
+              <w:bottom w:val="single" w:sz="6" w:color="000000"/>
+              <w:right w:val="nil"/>
+            </w:tcBorders>
+          </w:tcPr>
+          <w:p>
+            <w:pPr>
+              <w:keepNext/>
+              <w:spacing w:line="240" w:lineRule="auto" w:before="60" w:after="60"/>
+              <w:jc w:val="center"/>
+            </w:pPr>
+            <w:r/>
+            <w:r>
+              <w:t>Fase</w:t>
+            </w:r>
+          </w:p>
+        </w:tc>
+        <w:tc>
+          <w:tcPr>
+            <w:tcW w:type="dxa" w:w="1077"/>
+            <w:tcBorders>
+              <w:top w:val="single" w:sz="6" w:color="000000"/>
+              <w:left w:val="nil"/>
+              <w:bottom w:val="single" w:sz="6" w:color="000000"/>
+              <w:right w:val="nil"/>
+            </w:tcBorders>
+          </w:tcPr>
+          <w:p>
+            <w:pPr>
+              <w:keepNext/>
+              <w:spacing w:line="240" w:lineRule="auto" w:before="60" w:after="60"/>
+              <w:jc w:val="center"/>
+            </w:pPr>
+            <w:r/>
+            <w:r>
+              <w:rPr>
+                <w:i/>
+              </w:rPr>
+              <w:t>y</w:t>
+            </w:r>
+            <w:r>
+              <w:t xml:space="preserve"> (m)</w:t>
+            </w:r>
+          </w:p>
+        </w:tc>
+        <w:tc>
+          <w:tcPr>
+            <w:tcW w:type="dxa" w:w="1191"/>
+            <w:tcBorders>
+              <w:top w:val="single" w:sz="6" w:color="000000"/>
+              <w:left w:val="nil"/>
+              <w:bottom w:val="single" w:sz="6" w:color="000000"/>
+              <w:right w:val="nil"/>
+            </w:tcBorders>
+          </w:tcPr>
+          <w:p>
+            <w:pPr>
+              <w:keepNext/>
+              <w:spacing w:line="240" w:lineRule="auto" w:before="60" w:after="60"/>
+              <w:jc w:val="center"/>
+            </w:pPr>
+            <w:r/>
+            <w:r>
+              <w:rPr>
+                <w:i/>
+              </w:rPr>
+              <w:t>v</w:t>
+            </w:r>
+            <w:r>
+              <w:t xml:space="preserve"> (m/s)</w:t>
+            </w:r>
+          </w:p>
+        </w:tc>
+        <w:tc>
+          <w:tcPr>
+            <w:tcW w:type="dxa" w:w="1247"/>
+            <w:tcBorders>
+              <w:top w:val="single" w:sz="6" w:color="000000"/>
+              <w:left w:val="nil"/>
+              <w:bottom w:val="single" w:sz="6" w:color="000000"/>
+              <w:right w:val="nil"/>
+            </w:tcBorders>
+          </w:tcPr>
+          <w:p>
+            <w:pPr>
+              <w:keepNext/>
+              <w:spacing w:line="240" w:lineRule="auto" w:before="60" w:after="60"/>
+              <w:jc w:val="center"/>
+            </w:pPr>
+            <w:r/>
+            <w:r>
+              <w:rPr>
+                <w:i/>
+              </w:rPr>
+              <w:t>a</w:t>
+            </w:r>
+            <w:r>
+              <w:t xml:space="preserve"> (m/s²)</w:t>
+            </w:r>
+          </w:p>
+        </w:tc>
+        <w:tc>
+          <w:tcPr>
+            <w:tcW w:type="dxa" w:w="1134"/>
+            <w:tcBorders>
+              <w:top w:val="single" w:sz="6" w:color="000000"/>
+              <w:left w:val="nil"/>
+              <w:bottom w:val="single" w:sz="6" w:color="000000"/>
+              <w:right w:val="nil"/>
+            </w:tcBorders>
+          </w:tcPr>
+          <w:p>
+            <w:pPr>
+              <w:keepNext/>
+              <w:spacing w:line="240" w:lineRule="auto" w:before="60" w:after="60"/>
+              <w:jc w:val="center"/>
+            </w:pPr>
+            <w:r/>
+            <w:r>
+              <w:t>Σ</w:t>
+            </w:r>
+            <w:r>
+              <w:rPr>
+                <w:i/>
+              </w:rPr>
+              <w:t>F</w:t>
+            </w:r>
+            <w:r>
+              <w:t xml:space="preserve"> (N)</w:t>
+            </w:r>
+          </w:p>
+        </w:tc>
+        <w:tc>
+          <w:tcPr>
+            <w:tcW w:type="dxa" w:w="1134"/>
+            <w:tcBorders>
+              <w:top w:val="single" w:sz="6" w:color="000000"/>
+              <w:left w:val="nil"/>
+              <w:bottom w:val="single" w:sz="6" w:color="000000"/>
+              <w:right w:val="nil"/>
+            </w:tcBorders>
+          </w:tcPr>
+          <w:p>
+            <w:pPr>
+              <w:keepNext/>
+              <w:spacing w:line="240" w:lineRule="auto" w:before="60" w:after="60"/>
+              <w:jc w:val="center"/>
+            </w:pPr>
+            <w:r/>
+            <w:r>
+              <w:rPr>
+                <w:i/>
+              </w:rPr>
+              <w:t>T</w:t>
+            </w:r>
+            <w:r>
+              <w:t xml:space="preserve"> (N)</w:t>
+            </w:r>
+          </w:p>
+        </w:tc>
+      </w:tr>
+      <w:tr>
+        <w:trPr>
+          <w:cantSplit/>
+        </w:trPr>
+        <w:tc>
+          <w:tcPr>
+            <w:tcW w:type="dxa" w:w="907"/>
+            <w:tcBorders>
+              <w:top w:val="nil"/>
+              <w:left w:val="nil"/>
+              <w:bottom w:val="nil"/>
+              <w:right w:val="nil"/>
+            </w:tcBorders>
+          </w:tcPr>
+          <w:p>
+            <w:pPr>
+              <w:keepNext/>
+              <w:spacing w:line="240" w:lineRule="auto" w:before="60" w:after="60"/>
+              <w:jc w:val="right"/>
+            </w:pPr>
+            <w:r/>
+            <w:r>
+              <w:t>0,00</w:t>
+            </w:r>
+          </w:p>
+        </w:tc>
+        <w:tc>
+          <w:tcPr>
+            <w:tcW w:type="dxa" w:w="1701"/>
+            <w:tcBorders>
+              <w:top w:val="nil"/>
+              <w:left w:val="nil"/>
+              <w:bottom w:val="nil"/>
+              <w:right w:val="nil"/>
+            </w:tcBorders>
+          </w:tcPr>
+          <w:p>
+            <w:pPr>
+              <w:keepNext/>
+              <w:spacing w:line="240" w:lineRule="auto" w:before="60" w:after="60"/>
+            </w:pPr>
+            <w:r/>
+            <w:r>
+              <w:t>Arranque</w:t>
+            </w:r>
+          </w:p>
+        </w:tc>
+        <w:tc>
+          <w:tcPr>
+            <w:tcW w:type="dxa" w:w="1077"/>
+            <w:tcBorders>
+              <w:top w:val="nil"/>
+              <w:left w:val="nil"/>
+              <w:bottom w:val="nil"/>
+              <w:right w:val="nil"/>
+            </w:tcBorders>
+          </w:tcPr>
+          <w:p>
+            <w:pPr>
+              <w:keepNext/>
+              <w:spacing w:line="240" w:lineRule="auto" w:before="60" w:after="60"/>
+              <w:jc w:val="right"/>
+            </w:pPr>
+            <w:r/>
+            <w:r>
+              <w:t>0,00</w:t>
+            </w:r>
+          </w:p>
+        </w:tc>
+        <w:tc>
+          <w:tcPr>
+            <w:tcW w:type="dxa" w:w="1191"/>
+            <w:tcBorders>
+              <w:top w:val="nil"/>
+              <w:left w:val="nil"/>
+              <w:bottom w:val="nil"/>
+              <w:right w:val="nil"/>
+            </w:tcBorders>
+          </w:tcPr>
+          <w:p>
+            <w:pPr>
+              <w:keepNext/>
+              <w:spacing w:line="240" w:lineRule="auto" w:before="60" w:after="60"/>
+              <w:jc w:val="right"/>
+            </w:pPr>
+            <w:r/>
+            <w:r>
+              <w:t>0,00</w:t>
+            </w:r>
+          </w:p>
+        </w:tc>
+        <w:tc>
+          <w:tcPr>
+            <w:tcW w:type="dxa" w:w="1247"/>
+            <w:tcBorders>
+              <w:top w:val="nil"/>
+              <w:left w:val="nil"/>
+              <w:bottom w:val="nil"/>
+              <w:right w:val="nil"/>
+            </w:tcBorders>
+          </w:tcPr>
+          <w:p>
+            <w:pPr>
+              <w:keepNext/>
+              <w:spacing w:line="240" w:lineRule="auto" w:before="60" w:after="60"/>
+              <w:jc w:val="right"/>
+            </w:pPr>
+            <w:r/>
+            <w:r>
+              <w:t>1,50</w:t>
+            </w:r>
+          </w:p>
+        </w:tc>
+        <w:tc>
+          <w:tcPr>
+            <w:tcW w:type="dxa" w:w="1134"/>
+            <w:tcBorders>
+              <w:top w:val="nil"/>
+              <w:left w:val="nil"/>
+              <w:bottom w:val="nil"/>
+              <w:right w:val="nil"/>
+            </w:tcBorders>
+          </w:tcPr>
+          <w:p>
+            <w:pPr>
+              <w:keepNext/>
+              <w:spacing w:line="240" w:lineRule="auto" w:before="60" w:after="60"/>
+              <w:jc w:val="right"/>
+            </w:pPr>
+            <w:r/>
+            <w:r>
+              <w:t>1.050</w:t>
+            </w:r>
+          </w:p>
+        </w:tc>
+        <w:tc>
+          <w:tcPr>
+            <w:tcW w:type="dxa" w:w="1134"/>
+            <w:tcBorders>
+              <w:top w:val="nil"/>
+              <w:left w:val="nil"/>
+              <w:bottom w:val="nil"/>
+              <w:right w:val="nil"/>
+            </w:tcBorders>
+          </w:tcPr>
+          <w:p>
+            <w:pPr>
+              <w:keepNext/>
+              <w:spacing w:line="240" w:lineRule="auto" w:before="60" w:after="60"/>
+              <w:jc w:val="right"/>
+            </w:pPr>
+            <w:r/>
+            <w:r>
+              <w:t>7.917</w:t>
+            </w:r>
+          </w:p>
+        </w:tc>
+      </w:tr>
+      <w:tr>
+        <w:trPr>
+          <w:cantSplit/>
+        </w:trPr>
+        <w:tc>
+          <w:tcPr>
+            <w:tcW w:type="dxa" w:w="907"/>
+            <w:tcBorders>
+              <w:top w:val="nil"/>
+              <w:left w:val="nil"/>
+              <w:bottom w:val="nil"/>
+              <w:right w:val="nil"/>
+            </w:tcBorders>
+          </w:tcPr>
+          <w:p>
+            <w:pPr>
+              <w:keepNext/>
+              <w:spacing w:line="240" w:lineRule="auto" w:before="60" w:after="60"/>
+              <w:jc w:val="right"/>
+            </w:pPr>
+            <w:r/>
+            <w:r>
+              <w:t>0,50</w:t>
+            </w:r>
+          </w:p>
+        </w:tc>
+        <w:tc>
+          <w:tcPr>
+            <w:tcW w:type="dxa" w:w="1701"/>
+            <w:tcBorders>
+              <w:top w:val="nil"/>
+              <w:left w:val="nil"/>
+              <w:bottom w:val="nil"/>
+              <w:right w:val="nil"/>
+            </w:tcBorders>
+          </w:tcPr>
+          <w:p>
+            <w:pPr>
+              <w:keepNext/>
+              <w:spacing w:line="240" w:lineRule="auto" w:before="60" w:after="60"/>
+            </w:pPr>
+            <w:r/>
+            <w:r>
+              <w:t>Arranque</w:t>
+            </w:r>
+          </w:p>
+        </w:tc>
+        <w:tc>
+          <w:tcPr>
+            <w:tcW w:type="dxa" w:w="1077"/>
+            <w:tcBorders>
+              <w:top w:val="nil"/>
+              <w:left w:val="nil"/>
+              <w:bottom w:val="nil"/>
+              <w:right w:val="nil"/>
+            </w:tcBorders>
+          </w:tcPr>
+          <w:p>
+            <w:pPr>
+              <w:keepNext/>
+              <w:spacing w:line="240" w:lineRule="auto" w:before="60" w:after="60"/>
+              <w:jc w:val="right"/>
+            </w:pPr>
+            <w:r/>
+            <w:r>
+              <w:t>0,19</w:t>
+            </w:r>
+          </w:p>
+        </w:tc>
+        <w:tc>
+          <w:tcPr>
+            <w:tcW w:type="dxa" w:w="1191"/>
+            <w:tcBorders>
+              <w:top w:val="nil"/>
+              <w:left w:val="nil"/>
+              <w:bottom w:val="nil"/>
+              <w:right w:val="nil"/>
+            </w:tcBorders>
+          </w:tcPr>
+          <w:p>
+            <w:pPr>
+              <w:keepNext/>
+              <w:spacing w:line="240" w:lineRule="auto" w:before="60" w:after="60"/>
+              <w:jc w:val="right"/>
+            </w:pPr>
+            <w:r/>
+            <w:r>
+              <w:t>0,75</w:t>
+            </w:r>
+          </w:p>
+        </w:tc>
+        <w:tc>
+          <w:tcPr>
+            <w:tcW w:type="dxa" w:w="1247"/>
+            <w:tcBorders>
+              <w:top w:val="nil"/>
+              <w:left w:val="nil"/>
+              <w:bottom w:val="nil"/>
+              <w:right w:val="nil"/>
+            </w:tcBorders>
+          </w:tcPr>
+          <w:p>
+            <w:pPr>
+              <w:keepNext/>
+              <w:spacing w:line="240" w:lineRule="auto" w:before="60" w:after="60"/>
+              <w:jc w:val="right"/>
+            </w:pPr>
+            <w:r/>
+            <w:r>
+              <w:t>1,50</w:t>
+            </w:r>
+          </w:p>
+        </w:tc>
+        <w:tc>
+          <w:tcPr>
+            <w:tcW w:type="dxa" w:w="1134"/>
+            <w:tcBorders>
+              <w:top w:val="nil"/>
+              <w:left w:val="nil"/>
+              <w:bottom w:val="nil"/>
+              <w:right w:val="nil"/>
+            </w:tcBorders>
+          </w:tcPr>
+          <w:p>
+            <w:pPr>
+              <w:keepNext/>
+              <w:spacing w:line="240" w:lineRule="auto" w:before="60" w:after="60"/>
+              <w:jc w:val="right"/>
+            </w:pPr>
+            <w:r/>
+            <w:r>
+              <w:t>1.050</w:t>
+            </w:r>
+          </w:p>
+        </w:tc>
+        <w:tc>
+          <w:tcPr>
+            <w:tcW w:type="dxa" w:w="1134"/>
+            <w:tcBorders>
+              <w:top w:val="nil"/>
+              <w:left w:val="nil"/>
+              <w:bottom w:val="nil"/>
+              <w:right w:val="nil"/>
+            </w:tcBorders>
+          </w:tcPr>
+          <w:p>
+            <w:pPr>
+              <w:keepNext/>
+              <w:spacing w:line="240" w:lineRule="auto" w:before="60" w:after="60"/>
+              <w:jc w:val="right"/>
+            </w:pPr>
+            <w:r/>
+            <w:r>
+              <w:t>7.917</w:t>
+            </w:r>
+          </w:p>
+        </w:tc>
+      </w:tr>
+      <w:tr>
+        <w:trPr>
+          <w:cantSplit/>
+        </w:trPr>
+        <w:tc>
+          <w:tcPr>
+            <w:tcW w:type="dxa" w:w="907"/>
+            <w:tcBorders>
+              <w:top w:val="nil"/>
+              <w:left w:val="nil"/>
+              <w:bottom w:val="nil"/>
+              <w:right w:val="nil"/>
+            </w:tcBorders>
+          </w:tcPr>
+          <w:p>
+            <w:pPr>
+              <w:keepNext/>
+              <w:spacing w:line="240" w:lineRule="auto" w:before="60" w:after="60"/>
+              <w:jc w:val="right"/>
+            </w:pPr>
+            <w:r/>
+            <w:r>
+              <w:t>1,00</w:t>
+            </w:r>
+          </w:p>
+        </w:tc>
+        <w:tc>
+          <w:tcPr>
+            <w:tcW w:type="dxa" w:w="1701"/>
+            <w:tcBorders>
+              <w:top w:val="nil"/>
+              <w:left w:val="nil"/>
+              <w:bottom w:val="nil"/>
+              <w:right w:val="nil"/>
+            </w:tcBorders>
+          </w:tcPr>
+          <w:p>
+            <w:pPr>
+              <w:keepNext/>
+              <w:spacing w:line="240" w:lineRule="auto" w:before="60" w:after="60"/>
+            </w:pPr>
+            <w:r/>
+            <w:r>
+              <w:t>Arranque</w:t>
+            </w:r>
+          </w:p>
+        </w:tc>
+        <w:tc>
+          <w:tcPr>
+            <w:tcW w:type="dxa" w:w="1077"/>
+            <w:tcBorders>
+              <w:top w:val="nil"/>
+              <w:left w:val="nil"/>
+              <w:bottom w:val="nil"/>
+              <w:right w:val="nil"/>
+            </w:tcBorders>
+          </w:tcPr>
+          <w:p>
+            <w:pPr>
+              <w:keepNext/>
+              <w:spacing w:line="240" w:lineRule="auto" w:before="60" w:after="60"/>
+              <w:jc w:val="right"/>
+            </w:pPr>
+            <w:r/>
+            <w:r>
+              <w:t>0,75</w:t>
+            </w:r>
+          </w:p>
+        </w:tc>
+        <w:tc>
+          <w:tcPr>
+            <w:tcW w:type="dxa" w:w="1191"/>
+            <w:tcBorders>
+              <w:top w:val="nil"/>
+              <w:left w:val="nil"/>
+              <w:bottom w:val="nil"/>
+              <w:right w:val="nil"/>
+            </w:tcBorders>
+          </w:tcPr>
+          <w:p>
+            <w:pPr>
+              <w:keepNext/>
+              <w:spacing w:line="240" w:lineRule="auto" w:before="60" w:after="60"/>
+              <w:jc w:val="right"/>
+            </w:pPr>
+            <w:r/>
+            <w:r>
+              <w:t>1,50</w:t>
+            </w:r>
+          </w:p>
+        </w:tc>
+        <w:tc>
+          <w:tcPr>
+            <w:tcW w:type="dxa" w:w="1247"/>
+            <w:tcBorders>
+              <w:top w:val="nil"/>
+              <w:left w:val="nil"/>
+              <w:bottom w:val="nil"/>
+              <w:right w:val="nil"/>
+            </w:tcBorders>
+          </w:tcPr>
+          <w:p>
+            <w:pPr>
+              <w:keepNext/>
+              <w:spacing w:line="240" w:lineRule="auto" w:before="60" w:after="60"/>
+              <w:jc w:val="right"/>
+            </w:pPr>
+            <w:r/>
+            <w:r>
+              <w:t>1,50</w:t>
+            </w:r>
+          </w:p>
+        </w:tc>
+        <w:tc>
+          <w:tcPr>
+            <w:tcW w:type="dxa" w:w="1134"/>
+            <w:tcBorders>
+              <w:top w:val="nil"/>
+              <w:left w:val="nil"/>
+              <w:bottom w:val="nil"/>
+              <w:right w:val="nil"/>
+            </w:tcBorders>
+          </w:tcPr>
+          <w:p>
+            <w:pPr>
+              <w:keepNext/>
+              <w:spacing w:line="240" w:lineRule="auto" w:before="60" w:after="60"/>
+              <w:jc w:val="right"/>
+            </w:pPr>
+            <w:r/>
+            <w:r>
+              <w:t>1.050</w:t>
+            </w:r>
+          </w:p>
+        </w:tc>
+        <w:tc>
+          <w:tcPr>
+            <w:tcW w:type="dxa" w:w="1134"/>
+            <w:tcBorders>
+              <w:top w:val="nil"/>
+              <w:left w:val="nil"/>
+              <w:bottom w:val="nil"/>
+              <w:right w:val="nil"/>
+            </w:tcBorders>
+          </w:tcPr>
+          <w:p>
+            <w:pPr>
+              <w:keepNext/>
+              <w:spacing w:line="240" w:lineRule="auto" w:before="60" w:after="60"/>
+              <w:jc w:val="right"/>
+            </w:pPr>
+            <w:r/>
+            <w:r>
+              <w:t>7.917</w:t>
+            </w:r>
+          </w:p>
+        </w:tc>
+      </w:tr>
+      <w:tr>
+        <w:trPr>
+          <w:cantSplit/>
+        </w:trPr>
+        <w:tc>
+          <w:tcPr>
+            <w:tcW w:type="dxa" w:w="907"/>
+            <w:tcBorders>
+              <w:top w:val="nil"/>
+              <w:left w:val="nil"/>
+              <w:bottom w:val="nil"/>
+              <w:right w:val="nil"/>
+            </w:tcBorders>
+          </w:tcPr>
+          <w:p>
+            <w:pPr>
+              <w:keepNext/>
+              <w:spacing w:line="240" w:lineRule="auto" w:before="60" w:after="60"/>
+              <w:jc w:val="right"/>
+            </w:pPr>
+            <w:r/>
+            <w:r>
+              <w:t>1,67</w:t>
+            </w:r>
+          </w:p>
+        </w:tc>
+        <w:tc>
+          <w:tcPr>
+            <w:tcW w:type="dxa" w:w="1701"/>
+            <w:tcBorders>
+              <w:top w:val="nil"/>
+              <w:left w:val="nil"/>
+              <w:bottom w:val="nil"/>
+              <w:right w:val="nil"/>
+            </w:tcBorders>
+          </w:tcPr>
+          <w:p>
+            <w:pPr>
+              <w:keepNext/>
+              <w:spacing w:line="240" w:lineRule="auto" w:before="60" w:after="60"/>
+            </w:pPr>
+            <w:r/>
+            <w:r>
+              <w:t>Movimiento</w:t>
+            </w:r>
+          </w:p>
+        </w:tc>
+        <w:tc>
+          <w:tcPr>
+            <w:tcW w:type="dxa" w:w="1077"/>
+            <w:tcBorders>
+              <w:top w:val="nil"/>
+              <w:left w:val="nil"/>
+              <w:bottom w:val="nil"/>
+              <w:right w:val="nil"/>
+            </w:tcBorders>
+          </w:tcPr>
+          <w:p>
+            <w:pPr>
+              <w:keepNext/>
+              <w:spacing w:line="240" w:lineRule="auto" w:before="60" w:after="60"/>
+              <w:jc w:val="right"/>
+            </w:pPr>
+            <w:r/>
+            <w:r>
+              <w:t>2,08</w:t>
+            </w:r>
+          </w:p>
+        </w:tc>
+        <w:tc>
+          <w:tcPr>
+            <w:tcW w:type="dxa" w:w="1191"/>
+            <w:tcBorders>
+              <w:top w:val="nil"/>
+              <w:left w:val="nil"/>
+              <w:bottom w:val="nil"/>
+              <w:right w:val="nil"/>
+            </w:tcBorders>
+          </w:tcPr>
+          <w:p>
+            <w:pPr>
+              <w:keepNext/>
+              <w:spacing w:line="240" w:lineRule="auto" w:before="60" w:after="60"/>
+              <w:jc w:val="right"/>
+            </w:pPr>
+            <w:r/>
+            <w:r>
+              <w:t>2,50</w:t>
+            </w:r>
+          </w:p>
+        </w:tc>
+        <w:tc>
+          <w:tcPr>
+            <w:tcW w:type="dxa" w:w="1247"/>
+            <w:tcBorders>
+              <w:top w:val="nil"/>
+              <w:left w:val="nil"/>
+              <w:bottom w:val="nil"/>
+              <w:right w:val="nil"/>
+            </w:tcBorders>
+          </w:tcPr>
+          <w:p>
+            <w:pPr>
+              <w:keepNext/>
+              <w:spacing w:line="240" w:lineRule="auto" w:before="60" w:after="60"/>
+              <w:jc w:val="right"/>
+            </w:pPr>
+            <w:r/>
+            <w:r>
+              <w:t>0,00</w:t>
+            </w:r>
+          </w:p>
+        </w:tc>
+        <w:tc>
+          <w:tcPr>
+            <w:tcW w:type="dxa" w:w="1134"/>
+            <w:tcBorders>
+              <w:top w:val="nil"/>
+              <w:left w:val="nil"/>
+              <w:bottom w:val="nil"/>
+              <w:right w:val="nil"/>
+            </w:tcBorders>
+          </w:tcPr>
+          <w:p>
+            <w:pPr>
+              <w:keepNext/>
+              <w:spacing w:line="240" w:lineRule="auto" w:before="60" w:after="60"/>
+              <w:jc w:val="right"/>
+            </w:pPr>
+            <w:r/>
+            <w:r>
+              <w:t>0</w:t>
+            </w:r>
+          </w:p>
+        </w:tc>
+        <w:tc>
+          <w:tcPr>
+            <w:tcW w:type="dxa" w:w="1134"/>
+            <w:tcBorders>
+              <w:top w:val="nil"/>
+              <w:left w:val="nil"/>
+              <w:bottom w:val="nil"/>
+              <w:right w:val="nil"/>
+            </w:tcBorders>
+          </w:tcPr>
+          <w:p>
+            <w:pPr>
+              <w:keepNext/>
+              <w:spacing w:line="240" w:lineRule="auto" w:before="60" w:after="60"/>
+              <w:jc w:val="right"/>
+            </w:pPr>
+            <w:r/>
+            <w:r>
+              <w:t>6.867</w:t>
+            </w:r>
+          </w:p>
+        </w:tc>
+      </w:tr>
+      <w:tr>
+        <w:trPr>
+          <w:cantSplit/>
+        </w:trPr>
+        <w:tc>
+          <w:tcPr>
+            <w:tcW w:type="dxa" w:w="907"/>
+            <w:tcBorders>
+              <w:top w:val="nil"/>
+              <w:left w:val="nil"/>
+              <w:bottom w:val="nil"/>
+              <w:right w:val="nil"/>
+            </w:tcBorders>
+          </w:tcPr>
+          <w:p>
+            <w:pPr>
+              <w:keepNext/>
+              <w:spacing w:line="240" w:lineRule="auto" w:before="60" w:after="60"/>
+              <w:jc w:val="right"/>
+            </w:pPr>
+            <w:r/>
+            <w:r>
+              <w:t>2,50</w:t>
+            </w:r>
+          </w:p>
+        </w:tc>
+        <w:tc>
+          <w:tcPr>
+            <w:tcW w:type="dxa" w:w="1701"/>
+            <w:tcBorders>
+              <w:top w:val="nil"/>
+              <w:left w:val="nil"/>
+              <w:bottom w:val="nil"/>
+              <w:right w:val="nil"/>
+            </w:tcBorders>
+          </w:tcPr>
+          <w:p>
+            <w:pPr>
+              <w:keepNext/>
+              <w:spacing w:line="240" w:lineRule="auto" w:before="60" w:after="60"/>
+            </w:pPr>
+            <w:r/>
+            <w:r>
+              <w:t>Movimiento</w:t>
+            </w:r>
+          </w:p>
+        </w:tc>
+        <w:tc>
+          <w:tcPr>
+            <w:tcW w:type="dxa" w:w="1077"/>
+            <w:tcBorders>
+              <w:top w:val="nil"/>
+              <w:left w:val="nil"/>
+              <w:bottom w:val="nil"/>
+              <w:right w:val="nil"/>
+            </w:tcBorders>
+          </w:tcPr>
+          <w:p>
+            <w:pPr>
+              <w:keepNext/>
+              <w:spacing w:line="240" w:lineRule="auto" w:before="60" w:after="60"/>
+              <w:jc w:val="right"/>
+            </w:pPr>
+            <w:r/>
+            <w:r>
+              <w:t>4,17</w:t>
+            </w:r>
+          </w:p>
+        </w:tc>
+        <w:tc>
+          <w:tcPr>
+            <w:tcW w:type="dxa" w:w="1191"/>
+            <w:tcBorders>
+              <w:top w:val="nil"/>
+              <w:left w:val="nil"/>
+              <w:bottom w:val="nil"/>
+              <w:right w:val="nil"/>
+            </w:tcBorders>
+          </w:tcPr>
+          <w:p>
+            <w:pPr>
+              <w:keepNext/>
+              <w:spacing w:line="240" w:lineRule="auto" w:before="60" w:after="60"/>
+              <w:jc w:val="right"/>
+            </w:pPr>
+            <w:r/>
+            <w:r>
+              <w:t>2,50</w:t>
+            </w:r>
+          </w:p>
+        </w:tc>
+        <w:tc>
+          <w:tcPr>
+            <w:tcW w:type="dxa" w:w="1247"/>
+            <w:tcBorders>
+              <w:top w:val="nil"/>
+              <w:left w:val="nil"/>
+              <w:bottom w:val="nil"/>
+              <w:right w:val="nil"/>
+            </w:tcBorders>
+          </w:tcPr>
+          <w:p>
+            <w:pPr>
+              <w:keepNext/>
+              <w:spacing w:line="240" w:lineRule="auto" w:before="60" w:after="60"/>
+              <w:jc w:val="right"/>
+            </w:pPr>
+            <w:r/>
+            <w:r>
+              <w:t>0,00</w:t>
+            </w:r>
+          </w:p>
+        </w:tc>
+        <w:tc>
+          <w:tcPr>
+            <w:tcW w:type="dxa" w:w="1134"/>
+            <w:tcBorders>
+              <w:top w:val="nil"/>
+              <w:left w:val="nil"/>
+              <w:bottom w:val="nil"/>
+              <w:right w:val="nil"/>
+            </w:tcBorders>
+          </w:tcPr>
+          <w:p>
+            <w:pPr>
+              <w:keepNext/>
+              <w:spacing w:line="240" w:lineRule="auto" w:before="60" w:after="60"/>
+              <w:jc w:val="right"/>
+            </w:pPr>
+            <w:r/>
+            <w:r>
+              <w:t>0</w:t>
+            </w:r>
+          </w:p>
+        </w:tc>
+        <w:tc>
+          <w:tcPr>
+            <w:tcW w:type="dxa" w:w="1134"/>
+            <w:tcBorders>
+              <w:top w:val="nil"/>
+              <w:left w:val="nil"/>
+              <w:bottom w:val="nil"/>
+              <w:right w:val="nil"/>
+            </w:tcBorders>
+          </w:tcPr>
+          <w:p>
+            <w:pPr>
+              <w:keepNext/>
+              <w:spacing w:line="240" w:lineRule="auto" w:before="60" w:after="60"/>
+              <w:jc w:val="right"/>
+            </w:pPr>
+            <w:r/>
+            <w:r>
+              <w:t>6.867</w:t>
+            </w:r>
+          </w:p>
+        </w:tc>
+      </w:tr>
+      <w:tr>
+        <w:trPr>
+          <w:cantSplit/>
+        </w:trPr>
+        <w:tc>
+          <w:tcPr>
+            <w:tcW w:type="dxa" w:w="907"/>
+            <w:tcBorders>
+              <w:top w:val="nil"/>
+              <w:left w:val="nil"/>
+              <w:bottom w:val="nil"/>
+              <w:right w:val="nil"/>
+            </w:tcBorders>
+          </w:tcPr>
+          <w:p>
+            <w:pPr>
+              <w:keepNext/>
+              <w:spacing w:line="240" w:lineRule="auto" w:before="60" w:after="60"/>
+              <w:jc w:val="right"/>
+            </w:pPr>
+            <w:r/>
+            <w:r>
+              <w:t>3,20</w:t>
+            </w:r>
+          </w:p>
+        </w:tc>
+        <w:tc>
+          <w:tcPr>
+            <w:tcW w:type="dxa" w:w="1701"/>
+            <w:tcBorders>
+              <w:top w:val="nil"/>
+              <w:left w:val="nil"/>
+              <w:bottom w:val="nil"/>
+              <w:right w:val="nil"/>
+            </w:tcBorders>
+          </w:tcPr>
+          <w:p>
+            <w:pPr>
+              <w:keepNext/>
+              <w:spacing w:line="240" w:lineRule="auto" w:before="60" w:after="60"/>
+            </w:pPr>
+            <w:r/>
+            <w:r>
+              <w:t>Movimiento</w:t>
+            </w:r>
+          </w:p>
+        </w:tc>
+        <w:tc>
+          <w:tcPr>
+            <w:tcW w:type="dxa" w:w="1077"/>
+            <w:tcBorders>
+              <w:top w:val="nil"/>
+              <w:left w:val="nil"/>
+              <w:bottom w:val="nil"/>
+              <w:right w:val="nil"/>
+            </w:tcBorders>
+          </w:tcPr>
+          <w:p>
+            <w:pPr>
+              <w:keepNext/>
+              <w:spacing w:line="240" w:lineRule="auto" w:before="60" w:after="60"/>
+              <w:jc w:val="right"/>
+            </w:pPr>
+            <w:r/>
+            <w:r>
+              <w:t>5,92</w:t>
+            </w:r>
+          </w:p>
+        </w:tc>
+        <w:tc>
+          <w:tcPr>
+            <w:tcW w:type="dxa" w:w="1191"/>
+            <w:tcBorders>
+              <w:top w:val="nil"/>
+              <w:left w:val="nil"/>
+              <w:bottom w:val="nil"/>
+              <w:right w:val="nil"/>
+            </w:tcBorders>
+          </w:tcPr>
+          <w:p>
+            <w:pPr>
+              <w:keepNext/>
+              <w:spacing w:line="240" w:lineRule="auto" w:before="60" w:after="60"/>
+              <w:jc w:val="right"/>
+            </w:pPr>
+            <w:r/>
+            <w:r>
+              <w:t>2,50</w:t>
+            </w:r>
+          </w:p>
+        </w:tc>
+        <w:tc>
+          <w:tcPr>
+            <w:tcW w:type="dxa" w:w="1247"/>
+            <w:tcBorders>
+              <w:top w:val="nil"/>
+              <w:left w:val="nil"/>
+              <w:bottom w:val="nil"/>
+              <w:right w:val="nil"/>
+            </w:tcBorders>
+          </w:tcPr>
+          <w:p>
+            <w:pPr>
+              <w:keepNext/>
+              <w:spacing w:line="240" w:lineRule="auto" w:before="60" w:after="60"/>
+              <w:jc w:val="right"/>
+            </w:pPr>
+            <w:r/>
+            <w:r>
+              <w:t>0,00</w:t>
+            </w:r>
+          </w:p>
+        </w:tc>
+        <w:tc>
+          <w:tcPr>
+            <w:tcW w:type="dxa" w:w="1134"/>
+            <w:tcBorders>
+              <w:top w:val="nil"/>
+              <w:left w:val="nil"/>
+              <w:bottom w:val="nil"/>
+              <w:right w:val="nil"/>
+            </w:tcBorders>
+          </w:tcPr>
+          <w:p>
+            <w:pPr>
+              <w:keepNext/>
+              <w:spacing w:line="240" w:lineRule="auto" w:before="60" w:after="60"/>
+              <w:jc w:val="right"/>
+            </w:pPr>
+            <w:r/>
+            <w:r>
+              <w:t>0</w:t>
+            </w:r>
+          </w:p>
+        </w:tc>
+        <w:tc>
+          <w:tcPr>
+            <w:tcW w:type="dxa" w:w="1134"/>
+            <w:tcBorders>
+              <w:top w:val="nil"/>
+              <w:left w:val="nil"/>
+              <w:bottom w:val="nil"/>
+              <w:right w:val="nil"/>
+            </w:tcBorders>
+          </w:tcPr>
+          <w:p>
+            <w:pPr>
+              <w:keepNext/>
+              <w:spacing w:line="240" w:lineRule="auto" w:before="60" w:after="60"/>
+              <w:jc w:val="right"/>
+            </w:pPr>
+            <w:r/>
+            <w:r>
+              <w:t>6.867</w:t>
+            </w:r>
+          </w:p>
+        </w:tc>
+      </w:tr>
+      <w:tr>
+        <w:trPr>
+          <w:cantSplit/>
+        </w:trPr>
+        <w:tc>
+          <w:tcPr>
+            <w:tcW w:type="dxa" w:w="907"/>
+            <w:tcBorders>
+              <w:top w:val="nil"/>
+              <w:left w:val="nil"/>
+              <w:bottom w:val="nil"/>
+              <w:right w:val="nil"/>
+            </w:tcBorders>
+          </w:tcPr>
+          <w:p>
+            <w:pPr>
+              <w:keepNext/>
+              <w:spacing w:line="240" w:lineRule="auto" w:before="60" w:after="60"/>
+              <w:jc w:val="right"/>
+            </w:pPr>
+            <w:r/>
+            <w:r>
+              <w:t>4,00</w:t>
+            </w:r>
+          </w:p>
+        </w:tc>
+        <w:tc>
+          <w:tcPr>
+            <w:tcW w:type="dxa" w:w="1701"/>
+            <w:tcBorders>
+              <w:top w:val="nil"/>
+              <w:left w:val="nil"/>
+              <w:bottom w:val="nil"/>
+              <w:right w:val="nil"/>
+            </w:tcBorders>
+          </w:tcPr>
+          <w:p>
+            <w:pPr>
+              <w:keepNext/>
+              <w:spacing w:line="240" w:lineRule="auto" w:before="60" w:after="60"/>
+            </w:pPr>
+            <w:r/>
+            <w:r>
+              <w:t>Movimiento</w:t>
+            </w:r>
+          </w:p>
+        </w:tc>
+        <w:tc>
+          <w:tcPr>
+            <w:tcW w:type="dxa" w:w="1077"/>
+            <w:tcBorders>
+              <w:top w:val="nil"/>
+              <w:left w:val="nil"/>
+              <w:bottom w:val="nil"/>
+              <w:right w:val="nil"/>
+            </w:tcBorders>
+          </w:tcPr>
+          <w:p>
+            <w:pPr>
+              <w:keepNext/>
+              <w:spacing w:line="240" w:lineRule="auto" w:before="60" w:after="60"/>
+              <w:jc w:val="right"/>
+            </w:pPr>
+            <w:r/>
+            <w:r>
+              <w:t>7,92</w:t>
+            </w:r>
+          </w:p>
+        </w:tc>
+        <w:tc>
+          <w:tcPr>
+            <w:tcW w:type="dxa" w:w="1191"/>
+            <w:tcBorders>
+              <w:top w:val="nil"/>
+              <w:left w:val="nil"/>
+              <w:bottom w:val="nil"/>
+              <w:right w:val="nil"/>
+            </w:tcBorders>
+          </w:tcPr>
+          <w:p>
+            <w:pPr>
+              <w:keepNext/>
+              <w:spacing w:line="240" w:lineRule="auto" w:before="60" w:after="60"/>
+              <w:jc w:val="right"/>
+            </w:pPr>
+            <w:r/>
+            <w:r>
+              <w:t>2,50</w:t>
+            </w:r>
+          </w:p>
+        </w:tc>
+        <w:tc>
+          <w:tcPr>
+            <w:tcW w:type="dxa" w:w="1247"/>
+            <w:tcBorders>
+              <w:top w:val="nil"/>
+              <w:left w:val="nil"/>
+              <w:bottom w:val="nil"/>
+              <w:right w:val="nil"/>
+            </w:tcBorders>
+          </w:tcPr>
+          <w:p>
+            <w:pPr>
+              <w:keepNext/>
+              <w:spacing w:line="240" w:lineRule="auto" w:before="60" w:after="60"/>
+              <w:jc w:val="right"/>
+            </w:pPr>
+            <w:r/>
+            <w:r>
+              <w:t>0,00</w:t>
+            </w:r>
+          </w:p>
+        </w:tc>
+        <w:tc>
+          <w:tcPr>
+            <w:tcW w:type="dxa" w:w="1134"/>
+            <w:tcBorders>
+              <w:top w:val="nil"/>
+              <w:left w:val="nil"/>
+              <w:bottom w:val="nil"/>
+              <w:right w:val="nil"/>
+            </w:tcBorders>
+          </w:tcPr>
+          <w:p>
+            <w:pPr>
+              <w:keepNext/>
+              <w:spacing w:line="240" w:lineRule="auto" w:before="60" w:after="60"/>
+              <w:jc w:val="right"/>
+            </w:pPr>
+            <w:r/>
+            <w:r>
+              <w:t>0</w:t>
+            </w:r>
+          </w:p>
+        </w:tc>
+        <w:tc>
+          <w:tcPr>
+            <w:tcW w:type="dxa" w:w="1134"/>
+            <w:tcBorders>
+              <w:top w:val="nil"/>
+              <w:left w:val="nil"/>
+              <w:bottom w:val="nil"/>
+              <w:right w:val="nil"/>
+            </w:tcBorders>
+          </w:tcPr>
+          <w:p>
+            <w:pPr>
+              <w:keepNext/>
+              <w:spacing w:line="240" w:lineRule="auto" w:before="60" w:after="60"/>
+              <w:jc w:val="right"/>
+            </w:pPr>
+            <w:r/>
+            <w:r>
+              <w:t>6.867</w:t>
+            </w:r>
+          </w:p>
+        </w:tc>
+      </w:tr>
+      <w:tr>
+        <w:trPr>
+          <w:cantSplit/>
+        </w:trPr>
+        <w:tc>
+          <w:tcPr>
+            <w:tcW w:type="dxa" w:w="907"/>
+            <w:tcBorders>
+              <w:top w:val="nil"/>
+              <w:left w:val="nil"/>
+              <w:bottom w:val="nil"/>
+              <w:right w:val="nil"/>
+            </w:tcBorders>
+          </w:tcPr>
+          <w:p>
+            <w:pPr>
+              <w:keepNext/>
+              <w:spacing w:line="240" w:lineRule="auto" w:before="60" w:after="60"/>
+              <w:jc w:val="right"/>
+            </w:pPr>
+            <w:r/>
+            <w:r>
+              <w:t>4,80</w:t>
+            </w:r>
+          </w:p>
+        </w:tc>
+        <w:tc>
+          <w:tcPr>
+            <w:tcW w:type="dxa" w:w="1701"/>
+            <w:tcBorders>
+              <w:top w:val="nil"/>
+              <w:left w:val="nil"/>
+              <w:bottom w:val="nil"/>
+              <w:right w:val="nil"/>
+            </w:tcBorders>
+          </w:tcPr>
+          <w:p>
+            <w:pPr>
+              <w:keepNext/>
+              <w:spacing w:line="240" w:lineRule="auto" w:before="60" w:after="60"/>
+            </w:pPr>
+            <w:r/>
+            <w:r>
+              <w:t>Frenado</w:t>
+            </w:r>
+          </w:p>
+        </w:tc>
+        <w:tc>
+          <w:tcPr>
+            <w:tcW w:type="dxa" w:w="1077"/>
+            <w:tcBorders>
+              <w:top w:val="nil"/>
+              <w:left w:val="nil"/>
+              <w:bottom w:val="nil"/>
+              <w:right w:val="nil"/>
+            </w:tcBorders>
+          </w:tcPr>
+          <w:p>
+            <w:pPr>
+              <w:keepNext/>
+              <w:spacing w:line="240" w:lineRule="auto" w:before="60" w:after="60"/>
+              <w:jc w:val="right"/>
+            </w:pPr>
+            <w:r/>
+            <w:r>
+              <w:t>9,92</w:t>
+            </w:r>
+          </w:p>
+        </w:tc>
+        <w:tc>
+          <w:tcPr>
+            <w:tcW w:type="dxa" w:w="1191"/>
+            <w:tcBorders>
+              <w:top w:val="nil"/>
+              <w:left w:val="nil"/>
+              <w:bottom w:val="nil"/>
+              <w:right w:val="nil"/>
+            </w:tcBorders>
+          </w:tcPr>
+          <w:p>
+            <w:pPr>
+              <w:keepNext/>
+              <w:spacing w:line="240" w:lineRule="auto" w:before="60" w:after="60"/>
+              <w:jc w:val="right"/>
+            </w:pPr>
+            <w:r/>
+            <w:r>
+              <w:t>2,50</w:t>
+            </w:r>
+          </w:p>
+        </w:tc>
+        <w:tc>
+          <w:tcPr>
+            <w:tcW w:type="dxa" w:w="1247"/>
+            <w:tcBorders>
+              <w:top w:val="nil"/>
+              <w:left w:val="nil"/>
+              <w:bottom w:val="nil"/>
+              <w:right w:val="nil"/>
+            </w:tcBorders>
+          </w:tcPr>
+          <w:p>
+            <w:pPr>
+              <w:keepNext/>
+              <w:spacing w:line="240" w:lineRule="auto" w:before="60" w:after="60"/>
+              <w:jc w:val="right"/>
+            </w:pPr>
+            <w:r/>
+            <w:r>
+              <w:t>−1,50</w:t>
+            </w:r>
+          </w:p>
+        </w:tc>
+        <w:tc>
+          <w:tcPr>
+            <w:tcW w:type="dxa" w:w="1134"/>
+            <w:tcBorders>
+              <w:top w:val="nil"/>
+              <w:left w:val="nil"/>
+              <w:bottom w:val="nil"/>
+              <w:right w:val="nil"/>
+            </w:tcBorders>
+          </w:tcPr>
+          <w:p>
+            <w:pPr>
+              <w:keepNext/>
+              <w:spacing w:line="240" w:lineRule="auto" w:before="60" w:after="60"/>
+              <w:jc w:val="right"/>
+            </w:pPr>
+            <w:r/>
+            <w:r>
+              <w:t>−1.050</w:t>
+            </w:r>
+          </w:p>
+        </w:tc>
+        <w:tc>
+          <w:tcPr>
+            <w:tcW w:type="dxa" w:w="1134"/>
+            <w:tcBorders>
+              <w:top w:val="nil"/>
+              <w:left w:val="nil"/>
+              <w:bottom w:val="nil"/>
+              <w:right w:val="nil"/>
+            </w:tcBorders>
+          </w:tcPr>
+          <w:p>
+            <w:pPr>
+              <w:keepNext/>
+              <w:spacing w:line="240" w:lineRule="auto" w:before="60" w:after="60"/>
+              <w:jc w:val="right"/>
+            </w:pPr>
+            <w:r/>
+            <w:r>
+              <w:t>5.817</w:t>
+            </w:r>
+          </w:p>
+        </w:tc>
+      </w:tr>
+      <w:tr>
+        <w:trPr>
+          <w:cantSplit/>
+        </w:trPr>
+        <w:tc>
+          <w:tcPr>
+            <w:tcW w:type="dxa" w:w="907"/>
+            <w:tcBorders>
+              <w:top w:val="nil"/>
+              <w:left w:val="nil"/>
+              <w:bottom w:val="nil"/>
+              <w:right w:val="nil"/>
+            </w:tcBorders>
+          </w:tcPr>
+          <w:p>
+            <w:pPr>
+              <w:keepNext/>
+              <w:spacing w:line="240" w:lineRule="auto" w:before="60" w:after="60"/>
+              <w:jc w:val="right"/>
+            </w:pPr>
+            <w:r/>
+            <w:r>
+              <w:t>5,50</w:t>
+            </w:r>
+          </w:p>
+        </w:tc>
+        <w:tc>
+          <w:tcPr>
+            <w:tcW w:type="dxa" w:w="1701"/>
+            <w:tcBorders>
+              <w:top w:val="nil"/>
+              <w:left w:val="nil"/>
+              <w:bottom w:val="nil"/>
+              <w:right w:val="nil"/>
+            </w:tcBorders>
+          </w:tcPr>
+          <w:p>
+            <w:pPr>
+              <w:keepNext/>
+              <w:spacing w:line="240" w:lineRule="auto" w:before="60" w:after="60"/>
+            </w:pPr>
+            <w:r/>
+            <w:r>
+              <w:t>Frenado</w:t>
+            </w:r>
+          </w:p>
+        </w:tc>
+        <w:tc>
+          <w:tcPr>
+            <w:tcW w:type="dxa" w:w="1077"/>
+            <w:tcBorders>
+              <w:top w:val="nil"/>
+              <w:left w:val="nil"/>
+              <w:bottom w:val="nil"/>
+              <w:right w:val="nil"/>
+            </w:tcBorders>
+          </w:tcPr>
+          <w:p>
+            <w:pPr>
+              <w:keepNext/>
+              <w:spacing w:line="240" w:lineRule="auto" w:before="60" w:after="60"/>
+              <w:jc w:val="right"/>
+            </w:pPr>
+            <w:r/>
+            <w:r>
+              <w:t>11,30</w:t>
+            </w:r>
+          </w:p>
+        </w:tc>
+        <w:tc>
+          <w:tcPr>
+            <w:tcW w:type="dxa" w:w="1191"/>
+            <w:tcBorders>
+              <w:top w:val="nil"/>
+              <w:left w:val="nil"/>
+              <w:bottom w:val="nil"/>
+              <w:right w:val="nil"/>
+            </w:tcBorders>
+          </w:tcPr>
+          <w:p>
+            <w:pPr>
+              <w:keepNext/>
+              <w:spacing w:line="240" w:lineRule="auto" w:before="60" w:after="60"/>
+              <w:jc w:val="right"/>
+            </w:pPr>
+            <w:r/>
+            <w:r>
+              <w:t>1,45</w:t>
+            </w:r>
+          </w:p>
+        </w:tc>
+        <w:tc>
+          <w:tcPr>
+            <w:tcW w:type="dxa" w:w="1247"/>
+            <w:tcBorders>
+              <w:top w:val="nil"/>
+              <w:left w:val="nil"/>
+              <w:bottom w:val="nil"/>
+              <w:right w:val="nil"/>
+            </w:tcBorders>
+          </w:tcPr>
+          <w:p>
+            <w:pPr>
+              <w:keepNext/>
+              <w:spacing w:line="240" w:lineRule="auto" w:before="60" w:after="60"/>
+              <w:jc w:val="right"/>
+            </w:pPr>
+            <w:r/>
+            <w:r>
+              <w:t>−1,50</w:t>
+            </w:r>
+          </w:p>
+        </w:tc>
+        <w:tc>
+          <w:tcPr>
+            <w:tcW w:type="dxa" w:w="1134"/>
+            <w:tcBorders>
+              <w:top w:val="nil"/>
+              <w:left w:val="nil"/>
+              <w:bottom w:val="nil"/>
+              <w:right w:val="nil"/>
+            </w:tcBorders>
+          </w:tcPr>
+          <w:p>
+            <w:pPr>
+              <w:keepNext/>
+              <w:spacing w:line="240" w:lineRule="auto" w:before="60" w:after="60"/>
+              <w:jc w:val="right"/>
+            </w:pPr>
+            <w:r/>
+            <w:r>
+              <w:t>−1.050</w:t>
+            </w:r>
+          </w:p>
+        </w:tc>
+        <w:tc>
+          <w:tcPr>
+            <w:tcW w:type="dxa" w:w="1134"/>
+            <w:tcBorders>
+              <w:top w:val="nil"/>
+              <w:left w:val="nil"/>
+              <w:bottom w:val="nil"/>
+              <w:right w:val="nil"/>
+            </w:tcBorders>
+          </w:tcPr>
+          <w:p>
+            <w:pPr>
+              <w:keepNext/>
+              <w:spacing w:line="240" w:lineRule="auto" w:before="60" w:after="60"/>
+              <w:jc w:val="right"/>
+            </w:pPr>
+            <w:r/>
+            <w:r>
+              <w:t>5.817</w:t>
+            </w:r>
+          </w:p>
+        </w:tc>
+      </w:tr>
+      <w:tr>
+        <w:trPr>
+          <w:cantSplit/>
+        </w:trPr>
+        <w:tc>
+          <w:tcPr>
+            <w:tcW w:type="dxa" w:w="907"/>
+            <w:tcBorders>
+              <w:top w:val="nil"/>
+              <w:left w:val="nil"/>
+              <w:bottom w:val="single" w:sz="6" w:color="000000"/>
+              <w:right w:val="nil"/>
+            </w:tcBorders>
+          </w:tcPr>
+          <w:p>
+            <w:pPr>
+              <w:keepNext/>
+              <w:spacing w:line="240" w:lineRule="auto" w:before="60" w:after="60"/>
+              <w:jc w:val="right"/>
+            </w:pPr>
+            <w:r/>
+            <w:r>
+              <w:t>6,47</w:t>
+            </w:r>
+          </w:p>
+        </w:tc>
+        <w:tc>
+          <w:tcPr>
+            <w:tcW w:type="dxa" w:w="1701"/>
+            <w:tcBorders>
+              <w:top w:val="nil"/>
+              <w:left w:val="nil"/>
+              <w:bottom w:val="single" w:sz="6" w:color="000000"/>
+              <w:right w:val="nil"/>
+            </w:tcBorders>
+          </w:tcPr>
+          <w:p>
+            <w:pPr>
+              <w:keepNext/>
+              <w:spacing w:line="240" w:lineRule="auto" w:before="60" w:after="60"/>
+            </w:pPr>
+            <w:r/>
+            <w:r>
+              <w:t>Detención</w:t>
+            </w:r>
+          </w:p>
+        </w:tc>
+        <w:tc>
+          <w:tcPr>
+            <w:tcW w:type="dxa" w:w="1077"/>
+            <w:tcBorders>
+              <w:top w:val="nil"/>
+              <w:left w:val="nil"/>
+              <w:bottom w:val="single" w:sz="6" w:color="000000"/>
+              <w:right w:val="nil"/>
+            </w:tcBorders>
+          </w:tcPr>
+          <w:p>
+            <w:pPr>
+              <w:keepNext/>
+              <w:spacing w:line="240" w:lineRule="auto" w:before="60" w:after="60"/>
+              <w:jc w:val="right"/>
+            </w:pPr>
+            <w:r/>
+            <w:r>
+              <w:t>12,00</w:t>
+            </w:r>
+          </w:p>
+        </w:tc>
+        <w:tc>
+          <w:tcPr>
+            <w:tcW w:type="dxa" w:w="1191"/>
+            <w:tcBorders>
+              <w:top w:val="nil"/>
+              <w:left w:val="nil"/>
+              <w:bottom w:val="single" w:sz="6" w:color="000000"/>
+              <w:right w:val="nil"/>
+            </w:tcBorders>
+          </w:tcPr>
+          <w:p>
+            <w:pPr>
+              <w:keepNext/>
+              <w:spacing w:line="240" w:lineRule="auto" w:before="60" w:after="60"/>
+              <w:jc w:val="right"/>
+            </w:pPr>
+            <w:r/>
+            <w:r>
+              <w:t>0,00</w:t>
+            </w:r>
+          </w:p>
+        </w:tc>
+        <w:tc>
+          <w:tcPr>
+            <w:tcW w:type="dxa" w:w="1247"/>
+            <w:tcBorders>
+              <w:top w:val="nil"/>
+              <w:left w:val="nil"/>
+              <w:bottom w:val="single" w:sz="6" w:color="000000"/>
+              <w:right w:val="nil"/>
+            </w:tcBorders>
+          </w:tcPr>
+          <w:p>
+            <w:pPr>
+              <w:keepNext/>
+              <w:spacing w:line="240" w:lineRule="auto" w:before="60" w:after="60"/>
+              <w:jc w:val="right"/>
+            </w:pPr>
+            <w:r/>
+            <w:r>
+              <w:t>0,00</w:t>
+            </w:r>
+          </w:p>
+        </w:tc>
+        <w:tc>
+          <w:tcPr>
+            <w:tcW w:type="dxa" w:w="1134"/>
+            <w:tcBorders>
+              <w:top w:val="nil"/>
+              <w:left w:val="nil"/>
+              <w:bottom w:val="single" w:sz="6" w:color="000000"/>
+              <w:right w:val="nil"/>
+            </w:tcBorders>
+          </w:tcPr>
+          <w:p>
+            <w:pPr>
+              <w:keepNext/>
+              <w:spacing w:line="240" w:lineRule="auto" w:before="60" w:after="60"/>
+              <w:jc w:val="right"/>
+            </w:pPr>
+            <w:r/>
+            <w:r>
+              <w:t>0</w:t>
+            </w:r>
+          </w:p>
+        </w:tc>
+        <w:tc>
+          <w:tcPr>
+            <w:tcW w:type="dxa" w:w="1134"/>
+            <w:tcBorders>
+              <w:top w:val="nil"/>
+              <w:left w:val="nil"/>
+              <w:bottom w:val="single" w:sz="6" w:color="000000"/>
+              <w:right w:val="nil"/>
+            </w:tcBorders>
+          </w:tcPr>
+          <w:p>
+            <w:pPr>
+              <w:keepNext/>
+              <w:spacing w:line="240" w:lineRule="auto" w:before="60" w:after="60"/>
+              <w:jc w:val="right"/>
+            </w:pPr>
+            <w:r/>
+            <w:r>
+              <w:t>6.867</w:t>
+            </w:r>
+          </w:p>
+        </w:tc>
+      </w:tr>
+    </w:tbl>
+    <w:p>
+      <w:r>
+        <w:rPr>
+          <w:i/>
+        </w:rPr>
+        <w:t xml:space="preserve">Nota. </w:t>
+      </w:r>
+      <w:r>
+        <w:t xml:space="preserve">Valores tomados del panel En tiempo real del programa. El peso es constante: </w:t>
+      </w:r>
+      <w:r>
+        <w:rPr>
+          <w:i/>
+        </w:rPr>
+        <w:t>P</w:t>
+      </w:r>
+      <w:r>
+        <w:t xml:space="preserve"> = 6.867 N. A los 1,67 s termina el arranque y a los 4,80 s empieza el frenado.</w:t>
+      </w:r>
+    </w:p>
+    <w:p/>
+    <w:p>
+      <w:pPr>
+        <w:keepNext/>
+      </w:pPr>
+      <w:r>
+        <w:rPr>
+          <w:b/>
+        </w:rPr>
+        <w:t>Tabla 7</w:t>
       </w:r>
     </w:p>
     <w:p>
@@ -6382,6 +10137,79 @@
     </w:p>
     <w:p>
       <w:pPr>
+        <w:keepNext/>
+      </w:pPr>
+      <w:r>
+        <w:rPr>
+          <w:b/>
+        </w:rPr>
+        <w:t>Figura 8</w:t>
+      </w:r>
+    </w:p>
+    <w:p>
+      <w:pPr>
+        <w:keepNext/>
+      </w:pPr>
+      <w:r>
+        <w:rPr>
+          <w:i/>
+        </w:rPr>
+        <w:t>Gráficas de Posición, Velocidad y Aceleración contra el Tiempo del Viaje del Piso 1 al 5</w:t>
+      </w:r>
+    </w:p>
+    <w:p>
+      <w:pPr>
+        <w:keepNext/>
+        <w:spacing w:line="240" w:lineRule="auto"/>
+      </w:pPr>
+      <w:r>
+        <w:drawing>
+          <wp:inline xmlns:a="http://schemas.openxmlformats.org/drawingml/2006/main" xmlns:pic="http://schemas.openxmlformats.org/drawingml/2006/picture">
+            <wp:extent cx="5940000" cy="1846891"/>
+            <wp:docPr id="8" name="Picture 8"/>
+            <wp:cNvGraphicFramePr>
+              <a:graphicFrameLocks noChangeAspect="1"/>
+            </wp:cNvGraphicFramePr>
+            <a:graphic>
+              <a:graphicData uri="http://schemas.openxmlformats.org/drawingml/2006/picture">
+                <pic:pic>
+                  <pic:nvPicPr>
+                    <pic:cNvPr id="0" name="graficas.png"/>
+                    <pic:cNvPicPr/>
+                  </pic:nvPicPr>
+                  <pic:blipFill>
+                    <a:blip r:embed="rId17"/>
+                    <a:stretch>
+                      <a:fillRect/>
+                    </a:stretch>
+                  </pic:blipFill>
+                  <pic:spPr>
+                    <a:xfrm>
+                      <a:off x="0" y="0"/>
+                      <a:ext cx="5940000" cy="1846891"/>
+                    </a:xfrm>
+                    <a:prstGeom prst="rect"/>
+                  </pic:spPr>
+                </pic:pic>
+              </a:graphicData>
+            </a:graphic>
+          </wp:inline>
+        </w:drawing>
+      </w:r>
+    </w:p>
+    <w:p>
+      <w:r>
+        <w:rPr>
+          <w:i/>
+        </w:rPr>
+        <w:t xml:space="preserve">Nota. </w:t>
+      </w:r>
+      <w:r>
+        <w:t>Gráficas generadas por el programa al terminar la simulación. La aceleración es constante por tramos, la velocidad forma un trapecio y la posición combina dos arcos de parábola con un tramo recto.</w:t>
+      </w:r>
+    </w:p>
+    <w:p>
+      <w:pPr>
         <w:pStyle w:val="Heading1"/>
       </w:pPr>
       <w:r>
@@ -6812,7 +10640,7 @@
         <w:rPr>
           <w:b/>
         </w:rPr>
-        <w:t>Tabla 5</w:t>
+        <w:t>Tabla 8</w:t>
       </w:r>
     </w:p>
     <w:p>
@@ -9307,7 +13135,7 @@
         <w:rPr>
           <w:b/>
         </w:rPr>
-        <w:t>La forma de las gráficas refleja el tipo de movimiento.</w:t>
+        <w:t>La forma de las gráficas refleja el tipo de movimiento (Figura 8).</w:t>
       </w:r>
       <w:r>
         <w:t xml:space="preserve"> La gráfica de aceleración es constante por tramos: +1,5, 0 y −1,5 m/s². La de velocidad, que es su integral, forma un trapecio con rampas rectas en las fases aceleradas. La de posición está formada por dos arcos de parábola unidos por un tramo recto: las parábolas corresponden al MRUA y la recta al MRU. La pendiente de cada gráfica en un instante coincide con el valor de la siguiente, como predice la definición de velocidad y aceleración.</w:t>
@@ -9324,7 +13152,57 @@
         <w:t>Las fuerzas escalan con la masa.</w:t>
       </w:r>
       <w:r>
-        <w:t xml:space="preserve"> En el caso de carga pesada la masa pasa de 700 a 1.150 kg y todas las fuerzas crecen en la misma proporción (Tabla 4), mientras que los tiempos solo dependen de la aceleración, la velocidad máxima y la distancia. Es decir, el movimiento es el mismo para cualquier carga, pero el cable y el motor deben ser más resistentes.</w:t>
+        <w:t xml:space="preserve"> En el caso de carga pesada la masa pasa de 700 a 1.150 kg y todas las fuerzas crecen en la misma proporción (Tabla 7), mientras que los tiempos solo dependen de la aceleración, la velocidad máxima y la distancia. Es decir, el movimiento es el mismo para cualquier carga, pero el cable y el motor deben ser más resistentes.</w:t>
+      </w:r>
+    </w:p>
+    <w:p>
+      <w:pPr>
+        <w:ind w:firstLine="720"/>
+      </w:pPr>
+      <w:r>
+        <w:rPr>
+          <w:b/>
+        </w:rPr>
+        <w:t>Sobre el panel de ejemplo del enunciado.</w:t>
+      </w:r>
+      <w:r>
+        <w:t xml:space="preserve"> El enunciado muestra un panel con </w:t>
+      </w:r>
+      <w:r>
+        <w:rPr>
+          <w:i/>
+        </w:rPr>
+        <w:t>t</w:t>
+      </w:r>
+      <w:r>
+        <w:t xml:space="preserve"> = 3,2 s, </w:t>
+      </w:r>
+      <w:r>
+        <w:rPr>
+          <w:i/>
+        </w:rPr>
+        <w:t>y</w:t>
+      </w:r>
+      <w:r>
+        <w:t xml:space="preserve"> = 7,4 m, </w:t>
+      </w:r>
+      <w:r>
+        <w:rPr>
+          <w:i/>
+        </w:rPr>
+        <w:t>v</w:t>
+      </w:r>
+      <w:r>
+        <w:t xml:space="preserve"> = 2,5 m/s y </w:t>
+      </w:r>
+      <w:r>
+        <w:rPr>
+          <w:i/>
+        </w:rPr>
+        <w:t>a</w:t>
+      </w:r>
+      <w:r>
+        <w:t xml:space="preserve"> = 1,5 m/s². Esos valores son ilustrativos y no corresponden a un mismo instante de un viaje con aceleración constante: si a los 3,2 s la cabina siguiera acelerando con 1,5 m/s² desde el reposo, su velocidad sería 4,8 m/s, no 2,5 m/s. En el simulador la cabina alcanza 2,5 m/s a los 1,67 s y desde ahí viaja a velocidad constante, por lo que a los 3,2 s está en 5,92 m con aceleración cero y tensión igual al peso (Tabla 6). La fuerza neta de 1.050 N, el peso de 6.867 N y la tensión de 7.917 N del ejemplo sí coinciden con los que el programa calcula para la fase de arranque.</w:t>
       </w:r>
     </w:p>
     <w:p>

</xml_diff>